<commit_message>
docs: grid gotcha + README index backfill + erpnext_sbca Pharoh docs
</commit_message>
<xml_diff>
--- a/projects/erpnext_sbca/Sage_ERPNext_Accounting_Sync_Guide.docx
+++ b/projects/erpnext_sbca/Sage_ERPNext_Accounting_Sync_Guide.docx
@@ -59,7 +59,7 @@
           <w:sz w:val="22"/>
           <w:szCs w:val="22"/>
         </w:rPr>
-        <w:t xml:space="preserve">A plain-English guide for accountants and financial managers</w:t>
+        <w:t xml:space="preserve">How the two systems fit together — a complete reference for accountants and financial managers</w:t>
       </w:r>
     </w:p>
     <w:p>
@@ -77,7 +77,7 @@
           <w:sz w:val="32"/>
           <w:szCs w:val="32"/>
         </w:rPr>
-        <w:t xml:space="preserve">1. Why Two Systems?</w:t>
+        <w:t xml:space="preserve">1. The Big Picture</w:t>
       </w:r>
     </w:p>
     <w:p>
@@ -91,7 +91,21 @@
           <w:sz w:val="22"/>
           <w:szCs w:val="22"/>
         </w:rPr>
-        <w:t xml:space="preserve">Your business runs two complementary platforms that each do what they do best:</w:t>
+        <w:t xml:space="preserve">Your finance system is two platforms working as one. ERPNext is where the business operates — sales orders, purchase orders, invoices, stock and manufacturing. Sage Business Cloud Accounting is the financial ledger — it holds the statutory books, the VAT, and every customer and supplier payment.</w:t>
+      </w:r>
+    </w:p>
+    <w:p>
+      <w:pPr>
+        <w:spacing w:after="80" w:before="80"/>
+      </w:pPr>
+      <w:r>
+        <w:rPr>
+          <w:rFonts w:ascii="Arial" w:cs="Arial" w:eastAsia="Arial" w:hAnsi="Arial"/>
+          <w:color w:val="1A1A1A"/>
+          <w:sz w:val="22"/>
+          <w:szCs w:val="22"/>
+        </w:rPr>
+        <w:t xml:space="preserve">An integration layer — called Pharoh — runs constantly in the background, passing information between the two so that nothing has to be captured twice. The rule of thumb: operational documents are created in ERPNext and flow to Sage; the financial ledger, payments and tax live in Sage; and once a month ERPNext’s customer and supplier balances are brought back into line with Sage.</w:t>
       </w:r>
     </w:p>
     <w:tbl>
@@ -314,16 +328,20 @@
     </w:tbl>
     <w:p>
       <w:pPr>
-        <w:spacing w:after="80" w:before="80"/>
-      </w:pPr>
-      <w:r>
-        <w:rPr>
-          <w:rFonts w:ascii="Arial" w:cs="Arial" w:eastAsia="Arial" w:hAnsi="Arial"/>
-          <w:color w:val="1A1A1A"/>
-          <w:sz w:val="22"/>
-          <w:szCs w:val="22"/>
-        </w:rPr>
-        <w:t xml:space="preserve">Neither system duplicates the other’s job. Instead, a purpose-built integration layer — called Pharoh — keeps the two platforms in sync automatically, passing the right information in each direction without manual re-capturing.</w:t>
+        <w:shd w:fill="D6E4F0" w:color="auto" w:val="clear"/>
+        <w:spacing w:after="120" w:before="120"/>
+        <w:ind w:left="360" w:right="360"/>
+      </w:pPr>
+      <w:r>
+        <w:rPr>
+          <w:rFonts w:ascii="Arial" w:cs="Arial" w:eastAsia="Arial" w:hAnsi="Arial"/>
+          <w:i/>
+          <w:iCs/>
+          <w:color w:val="1F3864"/>
+          <w:sz w:val="20"/>
+          <w:szCs w:val="20"/>
+        </w:rPr>
+        <w:t xml:space="preserve">The short version: create each transaction once, in the system that owns it. The integration keeps the other side up to date.</w:t>
       </w:r>
     </w:p>
     <w:p>
@@ -341,7 +359,21 @@
           <w:sz w:val="32"/>
           <w:szCs w:val="32"/>
         </w:rPr>
-        <w:t xml:space="preserve">2. What Each System Owns</w:t>
+        <w:t xml:space="preserve">2. Who Owns the Truth</w:t>
+      </w:r>
+    </w:p>
+    <w:p>
+      <w:pPr>
+        <w:spacing w:after="80" w:before="80"/>
+      </w:pPr>
+      <w:r>
+        <w:rPr>
+          <w:rFonts w:ascii="Arial" w:cs="Arial" w:eastAsia="Arial" w:hAnsi="Arial"/>
+          <w:color w:val="1A1A1A"/>
+          <w:sz w:val="22"/>
+          <w:szCs w:val="22"/>
+        </w:rPr>
+        <w:t xml:space="preserve">When both systems hold the same kind of information, one of them is the authority. This is the map:</w:t>
       </w:r>
     </w:p>
     <w:tbl>
@@ -357,10 +389,9 @@
         </w:tblBorders>
       </w:tblPr>
       <w:tblGrid>
-        <w:gridCol w:w="2300"/>
-        <w:gridCol w:w="1450"/>
-        <w:gridCol w:w="1700"/>
+        <w:gridCol w:w="3450"/>
         <w:gridCol w:w="4188"/>
+        <w:gridCol w:w="2000"/>
       </w:tblGrid>
       <w:tr>
         <w:trPr>
@@ -368,7 +399,7 @@
         </w:trPr>
         <w:tc>
           <w:tcPr>
-            <w:tcW w:type="dxa" w:w="2300"/>
+            <w:tcW w:type="dxa" w:w="3450"/>
             <w:tcBorders>
               <w:top w:val="single" w:color="CCCCCC" w:sz="1"/>
               <w:left w:val="single" w:color="CCCCCC" w:sz="1"/>
@@ -394,13 +425,13 @@
                 <w:sz w:val="20"/>
                 <w:szCs w:val="20"/>
               </w:rPr>
-              <w:t xml:space="preserve">Area</w:t>
-            </w:r>
-          </w:p>
-        </w:tc>
-        <w:tc>
-          <w:tcPr>
-            <w:tcW w:type="dxa" w:w="1450"/>
+              <w:t xml:space="preserve">Concern</w:t>
+            </w:r>
+          </w:p>
+        </w:tc>
+        <w:tc>
+          <w:tcPr>
+            <w:tcW w:type="dxa" w:w="4188"/>
             <w:tcBorders>
               <w:top w:val="single" w:color="CCCCCC" w:sz="1"/>
               <w:left w:val="single" w:color="CCCCCC" w:sz="1"/>
@@ -426,13 +457,13 @@
                 <w:sz w:val="20"/>
                 <w:szCs w:val="20"/>
               </w:rPr>
-              <w:t xml:space="preserve">Captured in</w:t>
-            </w:r>
-          </w:p>
-        </w:tc>
-        <w:tc>
-          <w:tcPr>
-            <w:tcW w:type="dxa" w:w="1700"/>
+              <w:t xml:space="preserve">Source of truth</w:t>
+            </w:r>
+          </w:p>
+        </w:tc>
+        <w:tc>
+          <w:tcPr>
+            <w:tcW w:type="dxa" w:w="2000"/>
             <w:tcBorders>
               <w:top w:val="single" w:color="CCCCCC" w:sz="1"/>
               <w:left w:val="single" w:color="CCCCCC" w:sz="1"/>
@@ -458,20 +489,22 @@
                 <w:sz w:val="20"/>
                 <w:szCs w:val="20"/>
               </w:rPr>
-              <w:t xml:space="preserve">Reported from</w:t>
-            </w:r>
-          </w:p>
-        </w:tc>
-        <w:tc>
-          <w:tcPr>
-            <w:tcW w:type="dxa" w:w="4188"/>
-            <w:tcBorders>
-              <w:top w:val="single" w:color="CCCCCC" w:sz="1"/>
-              <w:left w:val="single" w:color="CCCCCC" w:sz="1"/>
-              <w:bottom w:val="single" w:color="CCCCCC" w:sz="1"/>
-              <w:right w:val="single" w:color="CCCCCC" w:sz="1"/>
-            </w:tcBorders>
-            <w:shd w:fill="1F3864" w:color="auto" w:val="clear"/>
+              <w:t xml:space="preserve">Where you work</w:t>
+            </w:r>
+          </w:p>
+        </w:tc>
+      </w:tr>
+      <w:tr>
+        <w:tc>
+          <w:tcPr>
+            <w:tcW w:type="dxa" w:w="3450"/>
+            <w:tcBorders>
+              <w:top w:val="single" w:color="CCCCCC" w:sz="1"/>
+              <w:left w:val="single" w:color="CCCCCC" w:sz="1"/>
+              <w:bottom w:val="single" w:color="CCCCCC" w:sz="1"/>
+              <w:right w:val="single" w:color="CCCCCC" w:sz="1"/>
+            </w:tcBorders>
+            <w:shd w:fill="F2F4F7" w:color="auto" w:val="clear"/>
             <w:tcMar>
               <w:top w:type="dxa" w:w="80"/>
               <w:left w:type="dxa" w:w="140"/>
@@ -486,11 +519,75 @@
                 <w:rFonts w:ascii="Arial" w:cs="Arial" w:eastAsia="Arial" w:hAnsi="Arial"/>
                 <w:b/>
                 <w:bCs/>
-                <w:color w:val="FFFFFF"/>
-                <w:sz w:val="20"/>
-                <w:szCs w:val="20"/>
-              </w:rPr>
-              <w:t xml:space="preserve">Notes</w:t>
+                <w:color w:val="1A1A1A"/>
+                <w:sz w:val="20"/>
+                <w:szCs w:val="20"/>
+              </w:rPr>
+              <w:t xml:space="preserve">Sales &amp; purchase invoices</w:t>
+            </w:r>
+          </w:p>
+        </w:tc>
+        <w:tc>
+          <w:tcPr>
+            <w:tcW w:type="dxa" w:w="4188"/>
+            <w:tcBorders>
+              <w:top w:val="single" w:color="CCCCCC" w:sz="1"/>
+              <w:left w:val="single" w:color="CCCCCC" w:sz="1"/>
+              <w:bottom w:val="single" w:color="CCCCCC" w:sz="1"/>
+              <w:right w:val="single" w:color="CCCCCC" w:sz="1"/>
+            </w:tcBorders>
+            <w:shd w:fill="F2F4F7" w:color="auto" w:val="clear"/>
+            <w:tcMar>
+              <w:top w:type="dxa" w:w="80"/>
+              <w:left w:type="dxa" w:w="140"/>
+              <w:bottom w:type="dxa" w:w="80"/>
+              <w:right w:type="dxa" w:w="140"/>
+            </w:tcMar>
+            <w:vAlign w:val="center"/>
+          </w:tcPr>
+          <w:p>
+            <w:r>
+              <w:rPr>
+                <w:rFonts w:ascii="Arial" w:cs="Arial" w:eastAsia="Arial" w:hAnsi="Arial"/>
+                <w:b w:val="false"/>
+                <w:bCs w:val="false"/>
+                <w:color w:val="1A1A1A"/>
+                <w:sz w:val="20"/>
+                <w:szCs w:val="20"/>
+              </w:rPr>
+              <w:t xml:space="preserve">Created in ERPNext; posted to Sage as the financial record</w:t>
+            </w:r>
+          </w:p>
+        </w:tc>
+        <w:tc>
+          <w:tcPr>
+            <w:tcW w:type="dxa" w:w="2000"/>
+            <w:tcBorders>
+              <w:top w:val="single" w:color="CCCCCC" w:sz="1"/>
+              <w:left w:val="single" w:color="CCCCCC" w:sz="1"/>
+              <w:bottom w:val="single" w:color="CCCCCC" w:sz="1"/>
+              <w:right w:val="single" w:color="CCCCCC" w:sz="1"/>
+            </w:tcBorders>
+            <w:shd w:fill="F2F4F7" w:color="auto" w:val="clear"/>
+            <w:tcMar>
+              <w:top w:type="dxa" w:w="80"/>
+              <w:left w:type="dxa" w:w="140"/>
+              <w:bottom w:type="dxa" w:w="80"/>
+              <w:right w:type="dxa" w:w="140"/>
+            </w:tcMar>
+            <w:vAlign w:val="center"/>
+          </w:tcPr>
+          <w:p>
+            <w:r>
+              <w:rPr>
+                <w:rFonts w:ascii="Arial" w:cs="Arial" w:eastAsia="Arial" w:hAnsi="Arial"/>
+                <w:b w:val="false"/>
+                <w:bCs w:val="false"/>
+                <w:color w:val="1A1A1A"/>
+                <w:sz w:val="20"/>
+                <w:szCs w:val="20"/>
+              </w:rPr>
+              <w:t xml:space="preserve">ERPNext</w:t>
             </w:r>
           </w:p>
         </w:tc>
@@ -498,7 +595,7 @@
       <w:tr>
         <w:tc>
           <w:tcPr>
-            <w:tcW w:type="dxa" w:w="2300"/>
+            <w:tcW w:type="dxa" w:w="3450"/>
             <w:tcBorders>
               <w:top w:val="single" w:color="CCCCCC" w:sz="1"/>
               <w:left w:val="single" w:color="CCCCCC" w:sz="1"/>
@@ -524,13 +621,13 @@
                 <w:sz w:val="20"/>
                 <w:szCs w:val="20"/>
               </w:rPr>
-              <w:t xml:space="preserve">Sales Invoices</w:t>
-            </w:r>
-          </w:p>
-        </w:tc>
-        <w:tc>
-          <w:tcPr>
-            <w:tcW w:type="dxa" w:w="1450"/>
+              <w:t xml:space="preserve">Sales &amp; purchase orders</w:t>
+            </w:r>
+          </w:p>
+        </w:tc>
+        <w:tc>
+          <w:tcPr>
+            <w:tcW w:type="dxa" w:w="4188"/>
             <w:tcBorders>
               <w:top w:val="single" w:color="CCCCCC" w:sz="1"/>
               <w:left w:val="single" w:color="CCCCCC" w:sz="1"/>
@@ -556,13 +653,13 @@
                 <w:sz w:val="20"/>
                 <w:szCs w:val="20"/>
               </w:rPr>
-              <w:t xml:space="preserve">ERPNext</w:t>
-            </w:r>
-          </w:p>
-        </w:tc>
-        <w:tc>
-          <w:tcPr>
-            <w:tcW w:type="dxa" w:w="1700"/>
+              <w:t xml:space="preserve">Created in ERPNext; sent to Sage; cancellations synced</w:t>
+            </w:r>
+          </w:p>
+        </w:tc>
+        <w:tc>
+          <w:tcPr>
+            <w:tcW w:type="dxa" w:w="2000"/>
             <w:tcBorders>
               <w:top w:val="single" w:color="CCCCCC" w:sz="1"/>
               <w:left w:val="single" w:color="CCCCCC" w:sz="1"/>
@@ -588,7 +685,41 @@
                 <w:sz w:val="20"/>
                 <w:szCs w:val="20"/>
               </w:rPr>
-              <w:t xml:space="preserve">Sage</w:t>
+              <w:t xml:space="preserve">ERPNext</w:t>
+            </w:r>
+          </w:p>
+        </w:tc>
+      </w:tr>
+      <w:tr>
+        <w:tc>
+          <w:tcPr>
+            <w:tcW w:type="dxa" w:w="3450"/>
+            <w:tcBorders>
+              <w:top w:val="single" w:color="CCCCCC" w:sz="1"/>
+              <w:left w:val="single" w:color="CCCCCC" w:sz="1"/>
+              <w:bottom w:val="single" w:color="CCCCCC" w:sz="1"/>
+              <w:right w:val="single" w:color="CCCCCC" w:sz="1"/>
+            </w:tcBorders>
+            <w:shd w:fill="F2F4F7" w:color="auto" w:val="clear"/>
+            <w:tcMar>
+              <w:top w:type="dxa" w:w="80"/>
+              <w:left w:type="dxa" w:w="140"/>
+              <w:bottom w:type="dxa" w:w="80"/>
+              <w:right w:type="dxa" w:w="140"/>
+            </w:tcMar>
+            <w:vAlign w:val="center"/>
+          </w:tcPr>
+          <w:p>
+            <w:r>
+              <w:rPr>
+                <w:rFonts w:ascii="Arial" w:cs="Arial" w:eastAsia="Arial" w:hAnsi="Arial"/>
+                <w:b/>
+                <w:bCs/>
+                <w:color w:val="1A1A1A"/>
+                <w:sz w:val="20"/>
+                <w:szCs w:val="20"/>
+              </w:rPr>
+              <w:t xml:space="preserve">Stock, inventory and manufacturing</w:t>
             </w:r>
           </w:p>
         </w:tc>
@@ -620,7 +751,39 @@
                 <w:sz w:val="20"/>
                 <w:szCs w:val="20"/>
               </w:rPr>
-              <w:t xml:space="preserve">Pushed to Sage on submit</w:t>
+              <w:t xml:space="preserve">ERPNext</w:t>
+            </w:r>
+          </w:p>
+        </w:tc>
+        <w:tc>
+          <w:tcPr>
+            <w:tcW w:type="dxa" w:w="2000"/>
+            <w:tcBorders>
+              <w:top w:val="single" w:color="CCCCCC" w:sz="1"/>
+              <w:left w:val="single" w:color="CCCCCC" w:sz="1"/>
+              <w:bottom w:val="single" w:color="CCCCCC" w:sz="1"/>
+              <w:right w:val="single" w:color="CCCCCC" w:sz="1"/>
+            </w:tcBorders>
+            <w:shd w:fill="F2F4F7" w:color="auto" w:val="clear"/>
+            <w:tcMar>
+              <w:top w:type="dxa" w:w="80"/>
+              <w:left w:type="dxa" w:w="140"/>
+              <w:bottom w:type="dxa" w:w="80"/>
+              <w:right w:type="dxa" w:w="140"/>
+            </w:tcMar>
+            <w:vAlign w:val="center"/>
+          </w:tcPr>
+          <w:p>
+            <w:r>
+              <w:rPr>
+                <w:rFonts w:ascii="Arial" w:cs="Arial" w:eastAsia="Arial" w:hAnsi="Arial"/>
+                <w:b w:val="false"/>
+                <w:bCs w:val="false"/>
+                <w:color w:val="1A1A1A"/>
+                <w:sz w:val="20"/>
+                <w:szCs w:val="20"/>
+              </w:rPr>
+              <w:t xml:space="preserve">ERPNext</w:t>
             </w:r>
           </w:p>
         </w:tc>
@@ -628,7 +791,7 @@
       <w:tr>
         <w:tc>
           <w:tcPr>
-            <w:tcW w:type="dxa" w:w="2300"/>
+            <w:tcW w:type="dxa" w:w="3450"/>
             <w:tcBorders>
               <w:top w:val="single" w:color="CCCCCC" w:sz="1"/>
               <w:left w:val="single" w:color="CCCCCC" w:sz="1"/>
@@ -654,13 +817,13 @@
                 <w:sz w:val="20"/>
                 <w:szCs w:val="20"/>
               </w:rPr>
-              <w:t xml:space="preserve">Purchase Invoices</w:t>
-            </w:r>
-          </w:p>
-        </w:tc>
-        <w:tc>
-          <w:tcPr>
-            <w:tcW w:type="dxa" w:w="1450"/>
+              <w:t xml:space="preserve">Customer receipts &amp; supplier payments</w:t>
+            </w:r>
+          </w:p>
+        </w:tc>
+        <w:tc>
+          <w:tcPr>
+            <w:tcW w:type="dxa" w:w="4188"/>
             <w:tcBorders>
               <w:top w:val="single" w:color="CCCCCC" w:sz="1"/>
               <w:left w:val="single" w:color="CCCCCC" w:sz="1"/>
@@ -686,13 +849,13 @@
                 <w:sz w:val="20"/>
                 <w:szCs w:val="20"/>
               </w:rPr>
-              <w:t xml:space="preserve">ERPNext</w:t>
-            </w:r>
-          </w:p>
-        </w:tc>
-        <w:tc>
-          <w:tcPr>
-            <w:tcW w:type="dxa" w:w="1700"/>
+              <w:t xml:space="preserve">Sage</w:t>
+            </w:r>
+          </w:p>
+        </w:tc>
+        <w:tc>
+          <w:tcPr>
+            <w:tcW w:type="dxa" w:w="2000"/>
             <w:tcBorders>
               <w:top w:val="single" w:color="CCCCCC" w:sz="1"/>
               <w:left w:val="single" w:color="CCCCCC" w:sz="1"/>
@@ -722,6 +885,40 @@
             </w:r>
           </w:p>
         </w:tc>
+      </w:tr>
+      <w:tr>
+        <w:tc>
+          <w:tcPr>
+            <w:tcW w:type="dxa" w:w="3450"/>
+            <w:tcBorders>
+              <w:top w:val="single" w:color="CCCCCC" w:sz="1"/>
+              <w:left w:val="single" w:color="CCCCCC" w:sz="1"/>
+              <w:bottom w:val="single" w:color="CCCCCC" w:sz="1"/>
+              <w:right w:val="single" w:color="CCCCCC" w:sz="1"/>
+            </w:tcBorders>
+            <w:shd w:fill="F2F4F7" w:color="auto" w:val="clear"/>
+            <w:tcMar>
+              <w:top w:type="dxa" w:w="80"/>
+              <w:left w:type="dxa" w:w="140"/>
+              <w:bottom w:type="dxa" w:w="80"/>
+              <w:right w:type="dxa" w:w="140"/>
+            </w:tcMar>
+            <w:vAlign w:val="center"/>
+          </w:tcPr>
+          <w:p>
+            <w:r>
+              <w:rPr>
+                <w:rFonts w:ascii="Arial" w:cs="Arial" w:eastAsia="Arial" w:hAnsi="Arial"/>
+                <w:b/>
+                <w:bCs/>
+                <w:color w:val="1A1A1A"/>
+                <w:sz w:val="20"/>
+                <w:szCs w:val="20"/>
+              </w:rPr>
+              <w:t xml:space="preserve">Credit notes, allocations, contra entries</w:t>
+            </w:r>
+          </w:p>
+        </w:tc>
         <w:tc>
           <w:tcPr>
             <w:tcW w:type="dxa" w:w="4188"/>
@@ -750,7 +947,39 @@
                 <w:sz w:val="20"/>
                 <w:szCs w:val="20"/>
               </w:rPr>
-              <w:t xml:space="preserve">Pushed to Sage on submit</w:t>
+              <w:t xml:space="preserve">Sage</w:t>
+            </w:r>
+          </w:p>
+        </w:tc>
+        <w:tc>
+          <w:tcPr>
+            <w:tcW w:type="dxa" w:w="2000"/>
+            <w:tcBorders>
+              <w:top w:val="single" w:color="CCCCCC" w:sz="1"/>
+              <w:left w:val="single" w:color="CCCCCC" w:sz="1"/>
+              <w:bottom w:val="single" w:color="CCCCCC" w:sz="1"/>
+              <w:right w:val="single" w:color="CCCCCC" w:sz="1"/>
+            </w:tcBorders>
+            <w:shd w:fill="F2F4F7" w:color="auto" w:val="clear"/>
+            <w:tcMar>
+              <w:top w:type="dxa" w:w="80"/>
+              <w:left w:type="dxa" w:w="140"/>
+              <w:bottom w:type="dxa" w:w="80"/>
+              <w:right w:type="dxa" w:w="140"/>
+            </w:tcMar>
+            <w:vAlign w:val="center"/>
+          </w:tcPr>
+          <w:p>
+            <w:r>
+              <w:rPr>
+                <w:rFonts w:ascii="Arial" w:cs="Arial" w:eastAsia="Arial" w:hAnsi="Arial"/>
+                <w:b w:val="false"/>
+                <w:bCs w:val="false"/>
+                <w:color w:val="1A1A1A"/>
+                <w:sz w:val="20"/>
+                <w:szCs w:val="20"/>
+              </w:rPr>
+              <w:t xml:space="preserve">Sage</w:t>
             </w:r>
           </w:p>
         </w:tc>
@@ -758,7 +987,7 @@
       <w:tr>
         <w:tc>
           <w:tcPr>
-            <w:tcW w:type="dxa" w:w="2300"/>
+            <w:tcW w:type="dxa" w:w="3450"/>
             <w:tcBorders>
               <w:top w:val="single" w:color="CCCCCC" w:sz="1"/>
               <w:left w:val="single" w:color="CCCCCC" w:sz="1"/>
@@ -784,13 +1013,13 @@
                 <w:sz w:val="20"/>
                 <w:szCs w:val="20"/>
               </w:rPr>
-              <w:t xml:space="preserve">Sales Orders</w:t>
-            </w:r>
-          </w:p>
-        </w:tc>
-        <w:tc>
-          <w:tcPr>
-            <w:tcW w:type="dxa" w:w="1450"/>
+              <w:t xml:space="preserve">VAT, tax periods, SARS submissions</w:t>
+            </w:r>
+          </w:p>
+        </w:tc>
+        <w:tc>
+          <w:tcPr>
+            <w:tcW w:type="dxa" w:w="4188"/>
             <w:tcBorders>
               <w:top w:val="single" w:color="CCCCCC" w:sz="1"/>
               <w:left w:val="single" w:color="CCCCCC" w:sz="1"/>
@@ -816,13 +1045,13 @@
                 <w:sz w:val="20"/>
                 <w:szCs w:val="20"/>
               </w:rPr>
-              <w:t xml:space="preserve">ERPNext</w:t>
-            </w:r>
-          </w:p>
-        </w:tc>
-        <w:tc>
-          <w:tcPr>
-            <w:tcW w:type="dxa" w:w="1700"/>
+              <w:t xml:space="preserve">Sage</w:t>
+            </w:r>
+          </w:p>
+        </w:tc>
+        <w:tc>
+          <w:tcPr>
+            <w:tcW w:type="dxa" w:w="2000"/>
             <w:tcBorders>
               <w:top w:val="single" w:color="CCCCCC" w:sz="1"/>
               <w:left w:val="single" w:color="CCCCCC" w:sz="1"/>
@@ -848,7 +1077,41 @@
                 <w:sz w:val="20"/>
                 <w:szCs w:val="20"/>
               </w:rPr>
-              <w:t xml:space="preserve">Both</w:t>
+              <w:t xml:space="preserve">Sage</w:t>
+            </w:r>
+          </w:p>
+        </w:tc>
+      </w:tr>
+      <w:tr>
+        <w:tc>
+          <w:tcPr>
+            <w:tcW w:type="dxa" w:w="3450"/>
+            <w:tcBorders>
+              <w:top w:val="single" w:color="CCCCCC" w:sz="1"/>
+              <w:left w:val="single" w:color="CCCCCC" w:sz="1"/>
+              <w:bottom w:val="single" w:color="CCCCCC" w:sz="1"/>
+              <w:right w:val="single" w:color="CCCCCC" w:sz="1"/>
+            </w:tcBorders>
+            <w:shd w:fill="F2F4F7" w:color="auto" w:val="clear"/>
+            <w:tcMar>
+              <w:top w:type="dxa" w:w="80"/>
+              <w:left w:type="dxa" w:w="140"/>
+              <w:bottom w:type="dxa" w:w="80"/>
+              <w:right w:type="dxa" w:w="140"/>
+            </w:tcMar>
+            <w:vAlign w:val="center"/>
+          </w:tcPr>
+          <w:p>
+            <w:r>
+              <w:rPr>
+                <w:rFonts w:ascii="Arial" w:cs="Arial" w:eastAsia="Arial" w:hAnsi="Arial"/>
+                <w:b/>
+                <w:bCs/>
+                <w:color w:val="1A1A1A"/>
+                <w:sz w:val="20"/>
+                <w:szCs w:val="20"/>
+              </w:rPr>
+              <w:t xml:space="preserve">Bank accounts &amp; bank reconciliation</w:t>
             </w:r>
           </w:p>
         </w:tc>
@@ -880,7 +1143,39 @@
                 <w:sz w:val="20"/>
                 <w:szCs w:val="20"/>
               </w:rPr>
-              <w:t xml:space="preserve">Pushed to Sage; cancellation synced</w:t>
+              <w:t xml:space="preserve">Sage</w:t>
+            </w:r>
+          </w:p>
+        </w:tc>
+        <w:tc>
+          <w:tcPr>
+            <w:tcW w:type="dxa" w:w="2000"/>
+            <w:tcBorders>
+              <w:top w:val="single" w:color="CCCCCC" w:sz="1"/>
+              <w:left w:val="single" w:color="CCCCCC" w:sz="1"/>
+              <w:bottom w:val="single" w:color="CCCCCC" w:sz="1"/>
+              <w:right w:val="single" w:color="CCCCCC" w:sz="1"/>
+            </w:tcBorders>
+            <w:shd w:fill="F2F4F7" w:color="auto" w:val="clear"/>
+            <w:tcMar>
+              <w:top w:type="dxa" w:w="80"/>
+              <w:left w:type="dxa" w:w="140"/>
+              <w:bottom w:type="dxa" w:w="80"/>
+              <w:right w:type="dxa" w:w="140"/>
+            </w:tcMar>
+            <w:vAlign w:val="center"/>
+          </w:tcPr>
+          <w:p>
+            <w:r>
+              <w:rPr>
+                <w:rFonts w:ascii="Arial" w:cs="Arial" w:eastAsia="Arial" w:hAnsi="Arial"/>
+                <w:b w:val="false"/>
+                <w:bCs w:val="false"/>
+                <w:color w:val="1A1A1A"/>
+                <w:sz w:val="20"/>
+                <w:szCs w:val="20"/>
+              </w:rPr>
+              <w:t xml:space="preserve">Sage</w:t>
             </w:r>
           </w:p>
         </w:tc>
@@ -888,7 +1183,7 @@
       <w:tr>
         <w:tc>
           <w:tcPr>
-            <w:tcW w:type="dxa" w:w="2300"/>
+            <w:tcW w:type="dxa" w:w="3450"/>
             <w:tcBorders>
               <w:top w:val="single" w:color="CCCCCC" w:sz="1"/>
               <w:left w:val="single" w:color="CCCCCC" w:sz="1"/>
@@ -914,13 +1209,13 @@
                 <w:sz w:val="20"/>
                 <w:szCs w:val="20"/>
               </w:rPr>
-              <w:t xml:space="preserve">Purchase Orders</w:t>
-            </w:r>
-          </w:p>
-        </w:tc>
-        <w:tc>
-          <w:tcPr>
-            <w:tcW w:type="dxa" w:w="1450"/>
+              <w:t xml:space="preserve">Chart of accounts</w:t>
+            </w:r>
+          </w:p>
+        </w:tc>
+        <w:tc>
+          <w:tcPr>
+            <w:tcW w:type="dxa" w:w="4188"/>
             <w:tcBorders>
               <w:top w:val="single" w:color="CCCCCC" w:sz="1"/>
               <w:left w:val="single" w:color="CCCCCC" w:sz="1"/>
@@ -946,13 +1241,13 @@
                 <w:sz w:val="20"/>
                 <w:szCs w:val="20"/>
               </w:rPr>
-              <w:t xml:space="preserve">ERPNext</w:t>
-            </w:r>
-          </w:p>
-        </w:tc>
-        <w:tc>
-          <w:tcPr>
-            <w:tcW w:type="dxa" w:w="1700"/>
+              <w:t xml:space="preserve">Sage (mirrored into ERPNext)</w:t>
+            </w:r>
+          </w:p>
+        </w:tc>
+        <w:tc>
+          <w:tcPr>
+            <w:tcW w:type="dxa" w:w="2000"/>
             <w:tcBorders>
               <w:top w:val="single" w:color="CCCCCC" w:sz="1"/>
               <w:left w:val="single" w:color="CCCCCC" w:sz="1"/>
@@ -978,7 +1273,41 @@
                 <w:sz w:val="20"/>
                 <w:szCs w:val="20"/>
               </w:rPr>
-              <w:t xml:space="preserve">Both</w:t>
+              <w:t xml:space="preserve">Sage</w:t>
+            </w:r>
+          </w:p>
+        </w:tc>
+      </w:tr>
+      <w:tr>
+        <w:tc>
+          <w:tcPr>
+            <w:tcW w:type="dxa" w:w="3450"/>
+            <w:tcBorders>
+              <w:top w:val="single" w:color="CCCCCC" w:sz="1"/>
+              <w:left w:val="single" w:color="CCCCCC" w:sz="1"/>
+              <w:bottom w:val="single" w:color="CCCCCC" w:sz="1"/>
+              <w:right w:val="single" w:color="CCCCCC" w:sz="1"/>
+            </w:tcBorders>
+            <w:shd w:fill="F2F4F7" w:color="auto" w:val="clear"/>
+            <w:tcMar>
+              <w:top w:type="dxa" w:w="80"/>
+              <w:left w:type="dxa" w:w="140"/>
+              <w:bottom w:type="dxa" w:w="80"/>
+              <w:right w:type="dxa" w:w="140"/>
+            </w:tcMar>
+            <w:vAlign w:val="center"/>
+          </w:tcPr>
+          <w:p>
+            <w:r>
+              <w:rPr>
+                <w:rFonts w:ascii="Arial" w:cs="Arial" w:eastAsia="Arial" w:hAnsi="Arial"/>
+                <w:b/>
+                <w:bCs/>
+                <w:color w:val="1A1A1A"/>
+                <w:sz w:val="20"/>
+                <w:szCs w:val="20"/>
+              </w:rPr>
+              <w:t xml:space="preserve">Customer &amp; supplier master and categories</w:t>
             </w:r>
           </w:p>
         </w:tc>
@@ -1010,7 +1339,39 @@
                 <w:sz w:val="20"/>
                 <w:szCs w:val="20"/>
               </w:rPr>
-              <w:t xml:space="preserve">Pushed to Sage; cancellation synced</w:t>
+              <w:t xml:space="preserve">Sage (mirrored into ERPNext)</w:t>
+            </w:r>
+          </w:p>
+        </w:tc>
+        <w:tc>
+          <w:tcPr>
+            <w:tcW w:type="dxa" w:w="2000"/>
+            <w:tcBorders>
+              <w:top w:val="single" w:color="CCCCCC" w:sz="1"/>
+              <w:left w:val="single" w:color="CCCCCC" w:sz="1"/>
+              <w:bottom w:val="single" w:color="CCCCCC" w:sz="1"/>
+              <w:right w:val="single" w:color="CCCCCC" w:sz="1"/>
+            </w:tcBorders>
+            <w:shd w:fill="F2F4F7" w:color="auto" w:val="clear"/>
+            <w:tcMar>
+              <w:top w:type="dxa" w:w="80"/>
+              <w:left w:type="dxa" w:w="140"/>
+              <w:bottom w:type="dxa" w:w="80"/>
+              <w:right w:type="dxa" w:w="140"/>
+            </w:tcMar>
+            <w:vAlign w:val="center"/>
+          </w:tcPr>
+          <w:p>
+            <w:r>
+              <w:rPr>
+                <w:rFonts w:ascii="Arial" w:cs="Arial" w:eastAsia="Arial" w:hAnsi="Arial"/>
+                <w:b w:val="false"/>
+                <w:bCs w:val="false"/>
+                <w:color w:val="1A1A1A"/>
+                <w:sz w:val="20"/>
+                <w:szCs w:val="20"/>
+              </w:rPr>
+              <w:t xml:space="preserve">Sage</w:t>
             </w:r>
           </w:p>
         </w:tc>
@@ -1018,7 +1379,7 @@
       <w:tr>
         <w:tc>
           <w:tcPr>
-            <w:tcW w:type="dxa" w:w="2300"/>
+            <w:tcW w:type="dxa" w:w="3450"/>
             <w:tcBorders>
               <w:top w:val="single" w:color="CCCCCC" w:sz="1"/>
               <w:left w:val="single" w:color="CCCCCC" w:sz="1"/>
@@ -1044,13 +1405,13 @@
                 <w:sz w:val="20"/>
                 <w:szCs w:val="20"/>
               </w:rPr>
-              <w:t xml:space="preserve">Supplier &amp; Customer Payments</w:t>
-            </w:r>
-          </w:p>
-        </w:tc>
-        <w:tc>
-          <w:tcPr>
-            <w:tcW w:type="dxa" w:w="1450"/>
+              <w:t xml:space="preserve">Month-end debtor &amp; creditor balances</w:t>
+            </w:r>
+          </w:p>
+        </w:tc>
+        <w:tc>
+          <w:tcPr>
+            <w:tcW w:type="dxa" w:w="4188"/>
             <w:tcBorders>
               <w:top w:val="single" w:color="CCCCCC" w:sz="1"/>
               <w:left w:val="single" w:color="CCCCCC" w:sz="1"/>
@@ -1076,13 +1437,13 @@
                 <w:sz w:val="20"/>
                 <w:szCs w:val="20"/>
               </w:rPr>
-              <w:t xml:space="preserve">Sage only</w:t>
-            </w:r>
-          </w:p>
-        </w:tc>
-        <w:tc>
-          <w:tcPr>
-            <w:tcW w:type="dxa" w:w="1700"/>
+              <w:t xml:space="preserve">Sage — ERPNext aligned to it each month</w:t>
+            </w:r>
+          </w:p>
+        </w:tc>
+        <w:tc>
+          <w:tcPr>
+            <w:tcW w:type="dxa" w:w="2000"/>
             <w:tcBorders>
               <w:top w:val="single" w:color="CCCCCC" w:sz="1"/>
               <w:left w:val="single" w:color="CCCCCC" w:sz="1"/>
@@ -1108,7 +1469,41 @@
                 <w:sz w:val="20"/>
                 <w:szCs w:val="20"/>
               </w:rPr>
-              <w:t xml:space="preserve">Sage</w:t>
+              <w:t xml:space="preserve">Both</w:t>
+            </w:r>
+          </w:p>
+        </w:tc>
+      </w:tr>
+      <w:tr>
+        <w:tc>
+          <w:tcPr>
+            <w:tcW w:type="dxa" w:w="3450"/>
+            <w:tcBorders>
+              <w:top w:val="single" w:color="CCCCCC" w:sz="1"/>
+              <w:left w:val="single" w:color="CCCCCC" w:sz="1"/>
+              <w:bottom w:val="single" w:color="CCCCCC" w:sz="1"/>
+              <w:right w:val="single" w:color="CCCCCC" w:sz="1"/>
+            </w:tcBorders>
+            <w:shd w:fill="F2F4F7" w:color="auto" w:val="clear"/>
+            <w:tcMar>
+              <w:top w:type="dxa" w:w="80"/>
+              <w:left w:type="dxa" w:w="140"/>
+              <w:bottom w:type="dxa" w:w="80"/>
+              <w:right w:type="dxa" w:w="140"/>
+            </w:tcMar>
+            <w:vAlign w:val="center"/>
+          </w:tcPr>
+          <w:p>
+            <w:r>
+              <w:rPr>
+                <w:rFonts w:ascii="Arial" w:cs="Arial" w:eastAsia="Arial" w:hAnsi="Arial"/>
+                <w:b/>
+                <w:bCs/>
+                <w:color w:val="1A1A1A"/>
+                <w:sz w:val="20"/>
+                <w:szCs w:val="20"/>
+              </w:rPr>
+              <w:t xml:space="preserve">Management &amp; consolidated reporting</w:t>
             </w:r>
           </w:p>
         </w:tc>
@@ -1140,47 +1535,13 @@
                 <w:sz w:val="20"/>
                 <w:szCs w:val="20"/>
               </w:rPr>
-              <w:t xml:space="preserve">Reconciled into ERPNext monthly (see 3.4)</w:t>
-            </w:r>
-          </w:p>
-        </w:tc>
-      </w:tr>
-      <w:tr>
-        <w:tc>
-          <w:tcPr>
-            <w:tcW w:type="dxa" w:w="2300"/>
-            <w:tcBorders>
-              <w:top w:val="single" w:color="CCCCCC" w:sz="1"/>
-              <w:left w:val="single" w:color="CCCCCC" w:sz="1"/>
-              <w:bottom w:val="single" w:color="CCCCCC" w:sz="1"/>
-              <w:right w:val="single" w:color="CCCCCC" w:sz="1"/>
-            </w:tcBorders>
-            <w:shd w:fill="F2F4F7" w:color="auto" w:val="clear"/>
-            <w:tcMar>
-              <w:top w:type="dxa" w:w="80"/>
-              <w:left w:type="dxa" w:w="140"/>
-              <w:bottom w:type="dxa" w:w="80"/>
-              <w:right w:type="dxa" w:w="140"/>
-            </w:tcMar>
-            <w:vAlign w:val="center"/>
-          </w:tcPr>
-          <w:p>
-            <w:r>
-              <w:rPr>
-                <w:rFonts w:ascii="Arial" w:cs="Arial" w:eastAsia="Arial" w:hAnsi="Arial"/>
-                <w:b/>
-                <w:bCs/>
-                <w:color w:val="1A1A1A"/>
-                <w:sz w:val="20"/>
-                <w:szCs w:val="20"/>
-              </w:rPr>
-              <w:t xml:space="preserve">VAT &amp; Tax Returns</w:t>
-            </w:r>
-          </w:p>
-        </w:tc>
-        <w:tc>
-          <w:tcPr>
-            <w:tcW w:type="dxa" w:w="1450"/>
+              <w:t xml:space="preserve">ERPNext, using the aligned figures</w:t>
+            </w:r>
+          </w:p>
+        </w:tc>
+        <w:tc>
+          <w:tcPr>
+            <w:tcW w:type="dxa" w:w="2000"/>
             <w:tcBorders>
               <w:top w:val="single" w:color="CCCCCC" w:sz="1"/>
               <w:left w:val="single" w:color="CCCCCC" w:sz="1"/>
@@ -1206,461 +1567,7 @@
                 <w:sz w:val="20"/>
                 <w:szCs w:val="20"/>
               </w:rPr>
-              <w:t xml:space="preserve">Sage only</w:t>
-            </w:r>
-          </w:p>
-        </w:tc>
-        <w:tc>
-          <w:tcPr>
-            <w:tcW w:type="dxa" w:w="1700"/>
-            <w:tcBorders>
-              <w:top w:val="single" w:color="CCCCCC" w:sz="1"/>
-              <w:left w:val="single" w:color="CCCCCC" w:sz="1"/>
-              <w:bottom w:val="single" w:color="CCCCCC" w:sz="1"/>
-              <w:right w:val="single" w:color="CCCCCC" w:sz="1"/>
-            </w:tcBorders>
-            <w:shd w:fill="F2F4F7" w:color="auto" w:val="clear"/>
-            <w:tcMar>
-              <w:top w:type="dxa" w:w="80"/>
-              <w:left w:type="dxa" w:w="140"/>
-              <w:bottom w:type="dxa" w:w="80"/>
-              <w:right w:type="dxa" w:w="140"/>
-            </w:tcMar>
-            <w:vAlign w:val="center"/>
-          </w:tcPr>
-          <w:p>
-            <w:r>
-              <w:rPr>
-                <w:rFonts w:ascii="Arial" w:cs="Arial" w:eastAsia="Arial" w:hAnsi="Arial"/>
-                <w:b w:val="false"/>
-                <w:bCs w:val="false"/>
-                <w:color w:val="1A1A1A"/>
-                <w:sz w:val="20"/>
-                <w:szCs w:val="20"/>
-              </w:rPr>
-              <w:t xml:space="preserve">Sage</w:t>
-            </w:r>
-          </w:p>
-        </w:tc>
-        <w:tc>
-          <w:tcPr>
-            <w:tcW w:type="dxa" w:w="4188"/>
-            <w:tcBorders>
-              <w:top w:val="single" w:color="CCCCCC" w:sz="1"/>
-              <w:left w:val="single" w:color="CCCCCC" w:sz="1"/>
-              <w:bottom w:val="single" w:color="CCCCCC" w:sz="1"/>
-              <w:right w:val="single" w:color="CCCCCC" w:sz="1"/>
-            </w:tcBorders>
-            <w:shd w:fill="F2F4F7" w:color="auto" w:val="clear"/>
-            <w:tcMar>
-              <w:top w:type="dxa" w:w="80"/>
-              <w:left w:type="dxa" w:w="140"/>
-              <w:bottom w:type="dxa" w:w="80"/>
-              <w:right w:type="dxa" w:w="140"/>
-            </w:tcMar>
-            <w:vAlign w:val="center"/>
-          </w:tcPr>
-          <w:p>
-            <w:r>
-              <w:rPr>
-                <w:rFonts w:ascii="Arial" w:cs="Arial" w:eastAsia="Arial" w:hAnsi="Arial"/>
-                <w:b w:val="false"/>
-                <w:bCs w:val="false"/>
-                <w:color w:val="1A1A1A"/>
-                <w:sz w:val="20"/>
-                <w:szCs w:val="20"/>
-              </w:rPr>
-              <w:t xml:space="preserve">Never touches ERPNext</w:t>
-            </w:r>
-          </w:p>
-        </w:tc>
-      </w:tr>
-      <w:tr>
-        <w:tc>
-          <w:tcPr>
-            <w:tcW w:type="dxa" w:w="2300"/>
-            <w:tcBorders>
-              <w:top w:val="single" w:color="CCCCCC" w:sz="1"/>
-              <w:left w:val="single" w:color="CCCCCC" w:sz="1"/>
-              <w:bottom w:val="single" w:color="CCCCCC" w:sz="1"/>
-              <w:right w:val="single" w:color="CCCCCC" w:sz="1"/>
-            </w:tcBorders>
-            <w:shd w:fill="F2F4F7" w:color="auto" w:val="clear"/>
-            <w:tcMar>
-              <w:top w:type="dxa" w:w="80"/>
-              <w:left w:type="dxa" w:w="140"/>
-              <w:bottom w:type="dxa" w:w="80"/>
-              <w:right w:type="dxa" w:w="140"/>
-            </w:tcMar>
-            <w:vAlign w:val="center"/>
-          </w:tcPr>
-          <w:p>
-            <w:r>
-              <w:rPr>
-                <w:rFonts w:ascii="Arial" w:cs="Arial" w:eastAsia="Arial" w:hAnsi="Arial"/>
-                <w:b/>
-                <w:bCs/>
-                <w:color w:val="1A1A1A"/>
-                <w:sz w:val="20"/>
-                <w:szCs w:val="20"/>
-              </w:rPr>
-              <w:t xml:space="preserve">Stock Movements</w:t>
-            </w:r>
-          </w:p>
-        </w:tc>
-        <w:tc>
-          <w:tcPr>
-            <w:tcW w:type="dxa" w:w="1450"/>
-            <w:tcBorders>
-              <w:top w:val="single" w:color="CCCCCC" w:sz="1"/>
-              <w:left w:val="single" w:color="CCCCCC" w:sz="1"/>
-              <w:bottom w:val="single" w:color="CCCCCC" w:sz="1"/>
-              <w:right w:val="single" w:color="CCCCCC" w:sz="1"/>
-            </w:tcBorders>
-            <w:shd w:fill="F2F4F7" w:color="auto" w:val="clear"/>
-            <w:tcMar>
-              <w:top w:type="dxa" w:w="80"/>
-              <w:left w:type="dxa" w:w="140"/>
-              <w:bottom w:type="dxa" w:w="80"/>
-              <w:right w:type="dxa" w:w="140"/>
-            </w:tcMar>
-            <w:vAlign w:val="center"/>
-          </w:tcPr>
-          <w:p>
-            <w:r>
-              <w:rPr>
-                <w:rFonts w:ascii="Arial" w:cs="Arial" w:eastAsia="Arial" w:hAnsi="Arial"/>
-                <w:b w:val="false"/>
-                <w:bCs w:val="false"/>
-                <w:color w:val="1A1A1A"/>
-                <w:sz w:val="20"/>
-                <w:szCs w:val="20"/>
-              </w:rPr>
               <w:t xml:space="preserve">ERPNext</w:t>
-            </w:r>
-          </w:p>
-        </w:tc>
-        <w:tc>
-          <w:tcPr>
-            <w:tcW w:type="dxa" w:w="1700"/>
-            <w:tcBorders>
-              <w:top w:val="single" w:color="CCCCCC" w:sz="1"/>
-              <w:left w:val="single" w:color="CCCCCC" w:sz="1"/>
-              <w:bottom w:val="single" w:color="CCCCCC" w:sz="1"/>
-              <w:right w:val="single" w:color="CCCCCC" w:sz="1"/>
-            </w:tcBorders>
-            <w:shd w:fill="F2F4F7" w:color="auto" w:val="clear"/>
-            <w:tcMar>
-              <w:top w:type="dxa" w:w="80"/>
-              <w:left w:type="dxa" w:w="140"/>
-              <w:bottom w:type="dxa" w:w="80"/>
-              <w:right w:type="dxa" w:w="140"/>
-            </w:tcMar>
-            <w:vAlign w:val="center"/>
-          </w:tcPr>
-          <w:p>
-            <w:r>
-              <w:rPr>
-                <w:rFonts w:ascii="Arial" w:cs="Arial" w:eastAsia="Arial" w:hAnsi="Arial"/>
-                <w:b w:val="false"/>
-                <w:bCs w:val="false"/>
-                <w:color w:val="1A1A1A"/>
-                <w:sz w:val="20"/>
-                <w:szCs w:val="20"/>
-              </w:rPr>
-              <w:t xml:space="preserve">ERPNext</w:t>
-            </w:r>
-          </w:p>
-        </w:tc>
-        <w:tc>
-          <w:tcPr>
-            <w:tcW w:type="dxa" w:w="4188"/>
-            <w:tcBorders>
-              <w:top w:val="single" w:color="CCCCCC" w:sz="1"/>
-              <w:left w:val="single" w:color="CCCCCC" w:sz="1"/>
-              <w:bottom w:val="single" w:color="CCCCCC" w:sz="1"/>
-              <w:right w:val="single" w:color="CCCCCC" w:sz="1"/>
-            </w:tcBorders>
-            <w:shd w:fill="F2F4F7" w:color="auto" w:val="clear"/>
-            <w:tcMar>
-              <w:top w:type="dxa" w:w="80"/>
-              <w:left w:type="dxa" w:w="140"/>
-              <w:bottom w:type="dxa" w:w="80"/>
-              <w:right w:type="dxa" w:w="140"/>
-            </w:tcMar>
-            <w:vAlign w:val="center"/>
-          </w:tcPr>
-          <w:p>
-            <w:r>
-              <w:rPr>
-                <w:rFonts w:ascii="Arial" w:cs="Arial" w:eastAsia="Arial" w:hAnsi="Arial"/>
-                <w:b w:val="false"/>
-                <w:bCs w:val="false"/>
-                <w:color w:val="1A1A1A"/>
-                <w:sz w:val="20"/>
-                <w:szCs w:val="20"/>
-              </w:rPr>
-              <w:t xml:space="preserve">Reflected as journals in Sage</w:t>
-            </w:r>
-          </w:p>
-        </w:tc>
-      </w:tr>
-      <w:tr>
-        <w:tc>
-          <w:tcPr>
-            <w:tcW w:type="dxa" w:w="2300"/>
-            <w:tcBorders>
-              <w:top w:val="single" w:color="CCCCCC" w:sz="1"/>
-              <w:left w:val="single" w:color="CCCCCC" w:sz="1"/>
-              <w:bottom w:val="single" w:color="CCCCCC" w:sz="1"/>
-              <w:right w:val="single" w:color="CCCCCC" w:sz="1"/>
-            </w:tcBorders>
-            <w:shd w:fill="F2F4F7" w:color="auto" w:val="clear"/>
-            <w:tcMar>
-              <w:top w:type="dxa" w:w="80"/>
-              <w:left w:type="dxa" w:w="140"/>
-              <w:bottom w:type="dxa" w:w="80"/>
-              <w:right w:type="dxa" w:w="140"/>
-            </w:tcMar>
-            <w:vAlign w:val="center"/>
-          </w:tcPr>
-          <w:p>
-            <w:r>
-              <w:rPr>
-                <w:rFonts w:ascii="Arial" w:cs="Arial" w:eastAsia="Arial" w:hAnsi="Arial"/>
-                <w:b/>
-                <w:bCs/>
-                <w:color w:val="1A1A1A"/>
-                <w:sz w:val="20"/>
-                <w:szCs w:val="20"/>
-              </w:rPr>
-              <w:t xml:space="preserve">Debtor / Creditor Ageing</w:t>
-            </w:r>
-          </w:p>
-        </w:tc>
-        <w:tc>
-          <w:tcPr>
-            <w:tcW w:type="dxa" w:w="1450"/>
-            <w:tcBorders>
-              <w:top w:val="single" w:color="CCCCCC" w:sz="1"/>
-              <w:left w:val="single" w:color="CCCCCC" w:sz="1"/>
-              <w:bottom w:val="single" w:color="CCCCCC" w:sz="1"/>
-              <w:right w:val="single" w:color="CCCCCC" w:sz="1"/>
-            </w:tcBorders>
-            <w:shd w:fill="F2F4F7" w:color="auto" w:val="clear"/>
-            <w:tcMar>
-              <w:top w:type="dxa" w:w="80"/>
-              <w:left w:type="dxa" w:w="140"/>
-              <w:bottom w:type="dxa" w:w="80"/>
-              <w:right w:type="dxa" w:w="140"/>
-            </w:tcMar>
-            <w:vAlign w:val="center"/>
-          </w:tcPr>
-          <w:p>
-            <w:r>
-              <w:rPr>
-                <w:rFonts w:ascii="Arial" w:cs="Arial" w:eastAsia="Arial" w:hAnsi="Arial"/>
-                <w:b w:val="false"/>
-                <w:bCs w:val="false"/>
-                <w:color w:val="1A1A1A"/>
-                <w:sz w:val="20"/>
-                <w:szCs w:val="20"/>
-              </w:rPr>
-              <w:t xml:space="preserve">Sage</w:t>
-            </w:r>
-          </w:p>
-        </w:tc>
-        <w:tc>
-          <w:tcPr>
-            <w:tcW w:type="dxa" w:w="1700"/>
-            <w:tcBorders>
-              <w:top w:val="single" w:color="CCCCCC" w:sz="1"/>
-              <w:left w:val="single" w:color="CCCCCC" w:sz="1"/>
-              <w:bottom w:val="single" w:color="CCCCCC" w:sz="1"/>
-              <w:right w:val="single" w:color="CCCCCC" w:sz="1"/>
-            </w:tcBorders>
-            <w:shd w:fill="F2F4F7" w:color="auto" w:val="clear"/>
-            <w:tcMar>
-              <w:top w:type="dxa" w:w="80"/>
-              <w:left w:type="dxa" w:w="140"/>
-              <w:bottom w:type="dxa" w:w="80"/>
-              <w:right w:type="dxa" w:w="140"/>
-            </w:tcMar>
-            <w:vAlign w:val="center"/>
-          </w:tcPr>
-          <w:p>
-            <w:r>
-              <w:rPr>
-                <w:rFonts w:ascii="Arial" w:cs="Arial" w:eastAsia="Arial" w:hAnsi="Arial"/>
-                <w:b w:val="false"/>
-                <w:bCs w:val="false"/>
-                <w:color w:val="1A1A1A"/>
-                <w:sz w:val="20"/>
-                <w:szCs w:val="20"/>
-              </w:rPr>
-              <w:t xml:space="preserve">ERPNext</w:t>
-            </w:r>
-          </w:p>
-        </w:tc>
-        <w:tc>
-          <w:tcPr>
-            <w:tcW w:type="dxa" w:w="4188"/>
-            <w:tcBorders>
-              <w:top w:val="single" w:color="CCCCCC" w:sz="1"/>
-              <w:left w:val="single" w:color="CCCCCC" w:sz="1"/>
-              <w:bottom w:val="single" w:color="CCCCCC" w:sz="1"/>
-              <w:right w:val="single" w:color="CCCCCC" w:sz="1"/>
-            </w:tcBorders>
-            <w:shd w:fill="F2F4F7" w:color="auto" w:val="clear"/>
-            <w:tcMar>
-              <w:top w:type="dxa" w:w="80"/>
-              <w:left w:type="dxa" w:w="140"/>
-              <w:bottom w:type="dxa" w:w="80"/>
-              <w:right w:type="dxa" w:w="140"/>
-            </w:tcMar>
-            <w:vAlign w:val="center"/>
-          </w:tcPr>
-          <w:p>
-            <w:r>
-              <w:rPr>
-                <w:rFonts w:ascii="Arial" w:cs="Arial" w:eastAsia="Arial" w:hAnsi="Arial"/>
-                <w:b w:val="false"/>
-                <w:bCs w:val="false"/>
-                <w:color w:val="1A1A1A"/>
-                <w:sz w:val="20"/>
-                <w:szCs w:val="20"/>
-              </w:rPr>
-              <w:t xml:space="preserve">Aligned monthly via reconciliation</w:t>
-            </w:r>
-          </w:p>
-        </w:tc>
-      </w:tr>
-      <w:tr>
-        <w:tc>
-          <w:tcPr>
-            <w:tcW w:type="dxa" w:w="2300"/>
-            <w:tcBorders>
-              <w:top w:val="single" w:color="CCCCCC" w:sz="1"/>
-              <w:left w:val="single" w:color="CCCCCC" w:sz="1"/>
-              <w:bottom w:val="single" w:color="CCCCCC" w:sz="1"/>
-              <w:right w:val="single" w:color="CCCCCC" w:sz="1"/>
-            </w:tcBorders>
-            <w:shd w:fill="F2F4F7" w:color="auto" w:val="clear"/>
-            <w:tcMar>
-              <w:top w:type="dxa" w:w="80"/>
-              <w:left w:type="dxa" w:w="140"/>
-              <w:bottom w:type="dxa" w:w="80"/>
-              <w:right w:type="dxa" w:w="140"/>
-            </w:tcMar>
-            <w:vAlign w:val="center"/>
-          </w:tcPr>
-          <w:p>
-            <w:r>
-              <w:rPr>
-                <w:rFonts w:ascii="Arial" w:cs="Arial" w:eastAsia="Arial" w:hAnsi="Arial"/>
-                <w:b/>
-                <w:bCs/>
-                <w:color w:val="1A1A1A"/>
-                <w:sz w:val="20"/>
-                <w:szCs w:val="20"/>
-              </w:rPr>
-              <w:t xml:space="preserve">Management Reports</w:t>
-            </w:r>
-          </w:p>
-        </w:tc>
-        <w:tc>
-          <w:tcPr>
-            <w:tcW w:type="dxa" w:w="1450"/>
-            <w:tcBorders>
-              <w:top w:val="single" w:color="CCCCCC" w:sz="1"/>
-              <w:left w:val="single" w:color="CCCCCC" w:sz="1"/>
-              <w:bottom w:val="single" w:color="CCCCCC" w:sz="1"/>
-              <w:right w:val="single" w:color="CCCCCC" w:sz="1"/>
-            </w:tcBorders>
-            <w:shd w:fill="F2F4F7" w:color="auto" w:val="clear"/>
-            <w:tcMar>
-              <w:top w:type="dxa" w:w="80"/>
-              <w:left w:type="dxa" w:w="140"/>
-              <w:bottom w:type="dxa" w:w="80"/>
-              <w:right w:type="dxa" w:w="140"/>
-            </w:tcMar>
-            <w:vAlign w:val="center"/>
-          </w:tcPr>
-          <w:p>
-            <w:r>
-              <w:rPr>
-                <w:rFonts w:ascii="Arial" w:cs="Arial" w:eastAsia="Arial" w:hAnsi="Arial"/>
-                <w:b w:val="false"/>
-                <w:bCs w:val="false"/>
-                <w:color w:val="1A1A1A"/>
-                <w:sz w:val="20"/>
-                <w:szCs w:val="20"/>
-              </w:rPr>
-              <w:t xml:space="preserve">Both</w:t>
-            </w:r>
-          </w:p>
-        </w:tc>
-        <w:tc>
-          <w:tcPr>
-            <w:tcW w:type="dxa" w:w="1700"/>
-            <w:tcBorders>
-              <w:top w:val="single" w:color="CCCCCC" w:sz="1"/>
-              <w:left w:val="single" w:color="CCCCCC" w:sz="1"/>
-              <w:bottom w:val="single" w:color="CCCCCC" w:sz="1"/>
-              <w:right w:val="single" w:color="CCCCCC" w:sz="1"/>
-            </w:tcBorders>
-            <w:shd w:fill="F2F4F7" w:color="auto" w:val="clear"/>
-            <w:tcMar>
-              <w:top w:type="dxa" w:w="80"/>
-              <w:left w:type="dxa" w:w="140"/>
-              <w:bottom w:type="dxa" w:w="80"/>
-              <w:right w:type="dxa" w:w="140"/>
-            </w:tcMar>
-            <w:vAlign w:val="center"/>
-          </w:tcPr>
-          <w:p>
-            <w:r>
-              <w:rPr>
-                <w:rFonts w:ascii="Arial" w:cs="Arial" w:eastAsia="Arial" w:hAnsi="Arial"/>
-                <w:b w:val="false"/>
-                <w:bCs w:val="false"/>
-                <w:color w:val="1A1A1A"/>
-                <w:sz w:val="20"/>
-                <w:szCs w:val="20"/>
-              </w:rPr>
-              <w:t xml:space="preserve">ERPNext</w:t>
-            </w:r>
-          </w:p>
-        </w:tc>
-        <w:tc>
-          <w:tcPr>
-            <w:tcW w:type="dxa" w:w="4188"/>
-            <w:tcBorders>
-              <w:top w:val="single" w:color="CCCCCC" w:sz="1"/>
-              <w:left w:val="single" w:color="CCCCCC" w:sz="1"/>
-              <w:bottom w:val="single" w:color="CCCCCC" w:sz="1"/>
-              <w:right w:val="single" w:color="CCCCCC" w:sz="1"/>
-            </w:tcBorders>
-            <w:shd w:fill="F2F4F7" w:color="auto" w:val="clear"/>
-            <w:tcMar>
-              <w:top w:type="dxa" w:w="80"/>
-              <w:left w:type="dxa" w:w="140"/>
-              <w:bottom w:type="dxa" w:w="80"/>
-              <w:right w:type="dxa" w:w="140"/>
-            </w:tcMar>
-            <w:vAlign w:val="center"/>
-          </w:tcPr>
-          <w:p>
-            <w:r>
-              <w:rPr>
-                <w:rFonts w:ascii="Arial" w:cs="Arial" w:eastAsia="Arial" w:hAnsi="Arial"/>
-                <w:b w:val="false"/>
-                <w:bCs w:val="false"/>
-                <w:color w:val="1A1A1A"/>
-                <w:sz w:val="20"/>
-                <w:szCs w:val="20"/>
-              </w:rPr>
-              <w:t xml:space="preserve">ERPNext uses aligned balances</w:t>
             </w:r>
           </w:p>
         </w:tc>
@@ -1681,15 +1588,26 @@
           <w:sz w:val="32"/>
           <w:szCs w:val="32"/>
         </w:rPr>
-        <w:t xml:space="preserve">3. How Transactions Flow</w:t>
-      </w:r>
-    </w:p>
-    <w:p>
-      <w:pPr>
-        <w:pBdr>
-          <w:bottom w:val="single" w:color="5B8DB8" w:sz="4" w:space="4"/>
-        </w:pBdr>
-        <w:spacing w:after="100" w:before="300"/>
+        <w:t xml:space="preserve">3. How It Fits Together</w:t>
+      </w:r>
+    </w:p>
+    <w:p>
+      <w:pPr>
+        <w:spacing w:after="80" w:before="80"/>
+      </w:pPr>
+      <w:r>
+        <w:rPr>
+          <w:rFonts w:ascii="Arial" w:cs="Arial" w:eastAsia="Arial" w:hAnsi="Arial"/>
+          <w:color w:val="1A1A1A"/>
+          <w:sz w:val="22"/>
+          <w:szCs w:val="22"/>
+        </w:rPr>
+        <w:t xml:space="preserve">There are only a handful of moments where information actually crosses between the two systems. Everything else stays internal to one side.</w:t>
+      </w:r>
+    </w:p>
+    <w:p>
+      <w:pPr>
+        <w:spacing w:after="40" w:before="200"/>
       </w:pPr>
       <w:r>
         <w:rPr>
@@ -1697,150 +1615,10 @@
           <w:b/>
           <w:bCs/>
           <w:color w:val="1F3864"/>
-          <w:sz w:val="26"/>
-          <w:szCs w:val="26"/>
-        </w:rPr>
-        <w:t xml:space="preserve">3.1 Sales Orders and Purchase Orders</w:t>
-      </w:r>
-    </w:p>
-    <w:p>
-      <w:pPr>
-        <w:spacing w:after="80" w:before="80"/>
-      </w:pPr>
-      <w:r>
-        <w:rPr>
-          <w:rFonts w:ascii="Arial" w:cs="Arial" w:eastAsia="Arial" w:hAnsi="Arial"/>
-          <w:color w:val="1A1A1A"/>
-          <w:sz w:val="22"/>
-          <w:szCs w:val="22"/>
-        </w:rPr>
-        <w:t xml:space="preserve">When a Sales Order or Purchase Order is confirmed and submitted in ERPNext, the integration automatically sends it to Sage in the background. The accountant sees the order appear in Sage within seconds, carrying the same document number and line values as in ERPNext.</w:t>
-      </w:r>
-    </w:p>
-    <w:p>
-      <w:pPr>
-        <w:spacing w:after="80" w:before="80"/>
-      </w:pPr>
-      <w:r>
-        <w:rPr>
-          <w:rFonts w:ascii="Arial" w:cs="Arial" w:eastAsia="Arial" w:hAnsi="Arial"/>
-          <w:color w:val="1A1A1A"/>
-          <w:sz w:val="22"/>
-          <w:szCs w:val="22"/>
-        </w:rPr>
-        <w:t xml:space="preserve">If the order is subsequently cancelled in ERPNext, Sage is updated at the same time — the document status in Sage is set to Cancelled automatically. No manual cancellation in Sage is required.</w:t>
-      </w:r>
-    </w:p>
-    <w:p>
-      <w:pPr>
-        <w:shd w:fill="D6E4F0" w:color="auto" w:val="clear"/>
-        <w:spacing w:after="120" w:before="120"/>
-        <w:ind w:left="360" w:right="360"/>
-      </w:pPr>
-      <w:r>
-        <w:rPr>
-          <w:rFonts w:ascii="Arial" w:cs="Arial" w:eastAsia="Arial" w:hAnsi="Arial"/>
-          <w:i/>
-          <w:iCs/>
-          <w:color w:val="1F3864"/>
-          <w:sz w:val="20"/>
-          <w:szCs w:val="20"/>
-        </w:rPr>
-        <w:t xml:space="preserve">Important: Physical stock items must always originate in ERPNext. Service-only invoices captured directly in Sage are acceptable and are handled by the monthly reconciliation process described in Section 3.4.</w:t>
-      </w:r>
-    </w:p>
-    <w:p>
-      <w:pPr>
-        <w:pBdr>
-          <w:bottom w:val="single" w:color="5B8DB8" w:sz="4" w:space="4"/>
-        </w:pBdr>
-        <w:spacing w:after="100" w:before="300"/>
-      </w:pPr>
-      <w:r>
-        <w:rPr>
-          <w:rFonts w:ascii="Arial" w:cs="Arial" w:eastAsia="Arial" w:hAnsi="Arial"/>
-          <w:b/>
-          <w:bCs/>
-          <w:color w:val="1F3864"/>
-          <w:sz w:val="26"/>
-          <w:szCs w:val="26"/>
-        </w:rPr>
-        <w:t xml:space="preserve">3.2 Stock Movements</w:t>
-      </w:r>
-    </w:p>
-    <w:p>
-      <w:pPr>
-        <w:spacing w:after="80" w:before="80"/>
-      </w:pPr>
-      <w:r>
-        <w:rPr>
-          <w:rFonts w:ascii="Arial" w:cs="Arial" w:eastAsia="Arial" w:hAnsi="Arial"/>
-          <w:color w:val="1A1A1A"/>
-          <w:sz w:val="22"/>
-          <w:szCs w:val="22"/>
-        </w:rPr>
-        <w:t xml:space="preserve">ERPNext is the single source of truth for stock. When stock moves — through a material issue, receipt, manufacturing process, kit build, or stock count reconciliation — ERPNext records the movement and calculates the accounting impact automatically using its General Ledger.</w:t>
-      </w:r>
-    </w:p>
-    <w:p>
-      <w:pPr>
-        <w:spacing w:after="80" w:before="80"/>
-      </w:pPr>
-      <w:r>
-        <w:rPr>
-          <w:rFonts w:ascii="Arial" w:cs="Arial" w:eastAsia="Arial" w:hAnsi="Arial"/>
-          <w:color w:val="1A1A1A"/>
-          <w:sz w:val="22"/>
-          <w:szCs w:val="22"/>
-        </w:rPr>
-        <w:t xml:space="preserve">The integration reads that General Ledger impact and posts a matching Journal Entry in Sage, keeping the stock-value accounts in both systems aligned. The journal in Sage references the original ERPNext document number so auditors can trace it back.</w:t>
-      </w:r>
-    </w:p>
-    <w:p>
-      <w:pPr>
-        <w:spacing w:after="80" w:before="80"/>
-      </w:pPr>
-      <w:r>
-        <w:rPr>
-          <w:rFonts w:ascii="Arial" w:cs="Arial" w:eastAsia="Arial" w:hAnsi="Arial"/>
-          <w:color w:val="1A1A1A"/>
-          <w:sz w:val="22"/>
-          <w:szCs w:val="22"/>
-        </w:rPr>
-        <w:t xml:space="preserve">Stock movements that carry no net change in value (for example, transferring goods between warehouses within the same company) are filtered out — only movements with a real accounting impact are sent to Sage.</w:t>
-      </w:r>
-    </w:p>
-    <w:p>
-      <w:pPr>
-        <w:pBdr>
-          <w:bottom w:val="single" w:color="5B8DB8" w:sz="4" w:space="4"/>
-        </w:pBdr>
-        <w:spacing w:after="100" w:before="300"/>
-      </w:pPr>
-      <w:r>
-        <w:rPr>
-          <w:rFonts w:ascii="Arial" w:cs="Arial" w:eastAsia="Arial" w:hAnsi="Arial"/>
-          <w:b/>
-          <w:bCs/>
-          <w:color w:val="1F3864"/>
-          <w:sz w:val="26"/>
-          <w:szCs w:val="26"/>
-        </w:rPr>
-        <w:t xml:space="preserve">3.3 The Clearing Account</w:t>
-      </w:r>
-    </w:p>
-    <w:p>
-      <w:pPr>
-        <w:spacing w:after="80" w:before="80"/>
-      </w:pPr>
-      <w:r>
-        <w:rPr>
-          <w:rFonts w:ascii="Arial" w:cs="Arial" w:eastAsia="Arial" w:hAnsi="Arial"/>
-          <w:color w:val="1A1A1A"/>
-          <w:sz w:val="22"/>
-          <w:szCs w:val="22"/>
-        </w:rPr>
-        <w:t xml:space="preserve">A dedicated “Sage Payments Clearing” account is maintained in ERPNext for each company. This account is the bridge between the two systems:</w:t>
+          <w:sz w:val="22"/>
+          <w:szCs w:val="22"/>
+        </w:rPr>
+        <w:t xml:space="preserve">ERPNext → Sage  (operational documents become financial records)</w:t>
       </w:r>
     </w:p>
     <w:p>
@@ -1859,7 +1637,7 @@
           <w:sz w:val="22"/>
           <w:szCs w:val="22"/>
         </w:rPr>
-        <w:t xml:space="preserve">When a customer pays in Sage, ERPNext never sees that individual payment — but the monthly reconciliation moves the equivalent amount through this clearing account.</w:t>
+        <w:t xml:space="preserve">Sales invoices and purchase invoices — posted to Sage automatically the moment you submit them in ERPNext.</w:t>
       </w:r>
     </w:p>
     <w:p>
@@ -1878,7 +1656,7 @@
           <w:sz w:val="22"/>
           <w:szCs w:val="22"/>
         </w:rPr>
-        <w:t xml:space="preserve">Every reconciliation journal has one side on the customer or supplier control account (Accounts Receivable or Accounts Payable) and the other side on this clearing account.</w:t>
+        <w:t xml:space="preserve">Sales orders and purchase orders — sent to Sage when submitted; if cancelled in ERPNext, the cancellation is mirrored to Sage.</w:t>
       </w:r>
     </w:p>
     <w:p>
@@ -1897,29 +1675,12 @@
           <w:sz w:val="22"/>
           <w:szCs w:val="22"/>
         </w:rPr>
-        <w:t xml:space="preserve">Over time, as Sage and ERPNext are kept in alignment, the clearing account nets to zero.</w:t>
-      </w:r>
-    </w:p>
-    <w:p>
-      <w:pPr>
-        <w:spacing w:after="80" w:before="80"/>
-      </w:pPr>
-      <w:r>
-        <w:rPr>
-          <w:rFonts w:ascii="Arial" w:cs="Arial" w:eastAsia="Arial" w:hAnsi="Arial"/>
-          <w:color w:val="1A1A1A"/>
-          <w:sz w:val="22"/>
-          <w:szCs w:val="22"/>
-        </w:rPr>
-        <w:t xml:space="preserve">The clearing account should be reviewed periodically. A persistent balance indicates either a reconciliation that has not yet run, or a discrepancy that needs investigation.</w:t>
-      </w:r>
-    </w:p>
-    <w:p>
-      <w:pPr>
-        <w:pBdr>
-          <w:bottom w:val="single" w:color="5B8DB8" w:sz="4" w:space="4"/>
-        </w:pBdr>
-        <w:spacing w:after="100" w:before="300"/>
+        <w:t xml:space="preserve">Stock-value movements — posted to Sage as journals so the stock accounts agree on both sides.</w:t>
+      </w:r>
+    </w:p>
+    <w:p>
+      <w:pPr>
+        <w:spacing w:after="40" w:before="200"/>
       </w:pPr>
       <w:r>
         <w:rPr>
@@ -1927,40 +1688,10 @@
           <w:b/>
           <w:bCs/>
           <w:color w:val="1F3864"/>
-          <w:sz w:val="26"/>
-          <w:szCs w:val="26"/>
-        </w:rPr>
-        <w:t xml:space="preserve">3.4 Monthly Payment Reconciliation</w:t>
-      </w:r>
-    </w:p>
-    <w:p>
-      <w:pPr>
-        <w:spacing w:after="80" w:before="80"/>
-      </w:pPr>
-      <w:r>
-        <w:rPr>
-          <w:rFonts w:ascii="Arial" w:cs="Arial" w:eastAsia="Arial" w:hAnsi="Arial"/>
-          <w:color w:val="1A1A1A"/>
-          <w:sz w:val="22"/>
-          <w:szCs w:val="22"/>
-        </w:rPr>
-        <w:t xml:space="preserve">Payments — customer receipts, supplier payments, credit note allocations, advance payments — are captured and managed entirely within Sage. ERPNext does not replicate individual payment transactions. Instead, a reconciliation process aligns the closing balances.</w:t>
-      </w:r>
-    </w:p>
-    <w:p>
-      <w:pPr>
-        <w:spacing w:after="40" w:before="200"/>
-      </w:pPr>
-      <w:r>
-        <w:rPr>
-          <w:rFonts w:ascii="Arial" w:cs="Arial" w:eastAsia="Arial" w:hAnsi="Arial"/>
-          <w:b/>
-          <w:bCs/>
-          <w:color w:val="1F3864"/>
-          <w:sz w:val="22"/>
-          <w:szCs w:val="22"/>
-        </w:rPr>
-        <w:t xml:space="preserve">How it works</w:t>
+          <w:sz w:val="22"/>
+          <w:szCs w:val="22"/>
+        </w:rPr>
+        <w:t xml:space="preserve">Sage → ERPNext  (the financial framework feeds the operation)</w:t>
       </w:r>
     </w:p>
     <w:p>
@@ -1979,7 +1710,7 @@
           <w:sz w:val="22"/>
           <w:szCs w:val="22"/>
         </w:rPr>
-        <w:t xml:space="preserve">The reconciliation job runs automatically once a day. Each run asks Sage for the closing balance of every customer and supplier that had activity in the period.</w:t>
+        <w:t xml:space="preserve">The chart of accounts, customers, suppliers and their categories, items, prices and stock levels are mirrored into ERPNext so everyone works off the same master data.</w:t>
       </w:r>
     </w:p>
     <w:p>
@@ -1998,7 +1729,166 @@
           <w:sz w:val="22"/>
           <w:szCs w:val="22"/>
         </w:rPr>
-        <w:t xml:space="preserve">It compares each Sage closing balance against the corresponding outstanding balance in ERPNext. The difference is called the delta.</w:t>
+        <w:t xml:space="preserve">Once a month, each customer’s and supplier’s closing balance is read from Sage and ERPNext’s debtor and creditor balances are adjusted to match.</w:t>
+      </w:r>
+    </w:p>
+    <w:p>
+      <w:pPr>
+        <w:pBdr>
+          <w:bottom w:val="single" w:color="5B8DB8" w:sz="4" w:space="4"/>
+        </w:pBdr>
+        <w:spacing w:after="100" w:before="300"/>
+      </w:pPr>
+      <w:r>
+        <w:rPr>
+          <w:rFonts w:ascii="Arial" w:cs="Arial" w:eastAsia="Arial" w:hAnsi="Arial"/>
+          <w:b/>
+          <w:bCs/>
+          <w:color w:val="1F3864"/>
+          <w:sz w:val="26"/>
+          <w:szCs w:val="26"/>
+        </w:rPr>
+        <w:t xml:space="preserve">3.1  Sales Orders and Purchase Orders</w:t>
+      </w:r>
+    </w:p>
+    <w:p>
+      <w:pPr>
+        <w:spacing w:after="80" w:before="80"/>
+      </w:pPr>
+      <w:r>
+        <w:rPr>
+          <w:rFonts w:ascii="Arial" w:cs="Arial" w:eastAsia="Arial" w:hAnsi="Arial"/>
+          <w:color w:val="1A1A1A"/>
+          <w:sz w:val="22"/>
+          <w:szCs w:val="22"/>
+        </w:rPr>
+        <w:t xml:space="preserve">When a Sales Order or Purchase Order is confirmed and submitted in ERPNext, the integration automatically sends it to Sage in the background. The accountant sees the order appear in Sage within seconds, carrying the same document number and line values as in ERPNext.</w:t>
+      </w:r>
+    </w:p>
+    <w:p>
+      <w:pPr>
+        <w:spacing w:after="80" w:before="80"/>
+      </w:pPr>
+      <w:r>
+        <w:rPr>
+          <w:rFonts w:ascii="Arial" w:cs="Arial" w:eastAsia="Arial" w:hAnsi="Arial"/>
+          <w:color w:val="1A1A1A"/>
+          <w:sz w:val="22"/>
+          <w:szCs w:val="22"/>
+        </w:rPr>
+        <w:t xml:space="preserve">If the order is subsequently cancelled in ERPNext, Sage is updated at the same time — the document status in Sage is set to Cancelled automatically. No manual cancellation in Sage is required.</w:t>
+      </w:r>
+    </w:p>
+    <w:p>
+      <w:pPr>
+        <w:shd w:fill="D6E4F0" w:color="auto" w:val="clear"/>
+        <w:spacing w:after="120" w:before="120"/>
+        <w:ind w:left="360" w:right="360"/>
+      </w:pPr>
+      <w:r>
+        <w:rPr>
+          <w:rFonts w:ascii="Arial" w:cs="Arial" w:eastAsia="Arial" w:hAnsi="Arial"/>
+          <w:i/>
+          <w:iCs/>
+          <w:color w:val="1F3864"/>
+          <w:sz w:val="20"/>
+          <w:szCs w:val="20"/>
+        </w:rPr>
+        <w:t xml:space="preserve">Important: Physical stock items must always originate in ERPNext. Service-only invoices captured directly in Sage are acceptable and are handled by the monthly reconciliation process described in Section 3.4.</w:t>
+      </w:r>
+    </w:p>
+    <w:p>
+      <w:pPr>
+        <w:pBdr>
+          <w:bottom w:val="single" w:color="5B8DB8" w:sz="4" w:space="4"/>
+        </w:pBdr>
+        <w:spacing w:after="100" w:before="300"/>
+      </w:pPr>
+      <w:r>
+        <w:rPr>
+          <w:rFonts w:ascii="Arial" w:cs="Arial" w:eastAsia="Arial" w:hAnsi="Arial"/>
+          <w:b/>
+          <w:bCs/>
+          <w:color w:val="1F3864"/>
+          <w:sz w:val="26"/>
+          <w:szCs w:val="26"/>
+        </w:rPr>
+        <w:t xml:space="preserve">3.2  Stock Movements</w:t>
+      </w:r>
+    </w:p>
+    <w:p>
+      <w:pPr>
+        <w:spacing w:after="80" w:before="80"/>
+      </w:pPr>
+      <w:r>
+        <w:rPr>
+          <w:rFonts w:ascii="Arial" w:cs="Arial" w:eastAsia="Arial" w:hAnsi="Arial"/>
+          <w:color w:val="1A1A1A"/>
+          <w:sz w:val="22"/>
+          <w:szCs w:val="22"/>
+        </w:rPr>
+        <w:t xml:space="preserve">ERPNext is the single source of truth for stock. When stock moves — through a material issue, receipt, manufacturing process, kit build, or stock count reconciliation — ERPNext records the movement and calculates the accounting impact automatically using its General Ledger.</w:t>
+      </w:r>
+    </w:p>
+    <w:p>
+      <w:pPr>
+        <w:spacing w:after="80" w:before="80"/>
+      </w:pPr>
+      <w:r>
+        <w:rPr>
+          <w:rFonts w:ascii="Arial" w:cs="Arial" w:eastAsia="Arial" w:hAnsi="Arial"/>
+          <w:color w:val="1A1A1A"/>
+          <w:sz w:val="22"/>
+          <w:szCs w:val="22"/>
+        </w:rPr>
+        <w:t xml:space="preserve">The integration reads that General Ledger impact and posts a matching Journal Entry in Sage, keeping the stock-value accounts in both systems aligned. The journal in Sage references the original ERPNext document number so auditors can trace it back.</w:t>
+      </w:r>
+    </w:p>
+    <w:p>
+      <w:pPr>
+        <w:spacing w:after="80" w:before="80"/>
+      </w:pPr>
+      <w:r>
+        <w:rPr>
+          <w:rFonts w:ascii="Arial" w:cs="Arial" w:eastAsia="Arial" w:hAnsi="Arial"/>
+          <w:color w:val="1A1A1A"/>
+          <w:sz w:val="22"/>
+          <w:szCs w:val="22"/>
+        </w:rPr>
+        <w:t xml:space="preserve">Stock movements that carry no net change in value (for example, transferring goods between warehouses within the same company) are filtered out — only movements with a real accounting impact are sent to Sage.</w:t>
+      </w:r>
+    </w:p>
+    <w:p>
+      <w:pPr>
+        <w:pBdr>
+          <w:bottom w:val="single" w:color="5B8DB8" w:sz="4" w:space="4"/>
+        </w:pBdr>
+        <w:spacing w:after="100" w:before="300"/>
+      </w:pPr>
+      <w:r>
+        <w:rPr>
+          <w:rFonts w:ascii="Arial" w:cs="Arial" w:eastAsia="Arial" w:hAnsi="Arial"/>
+          <w:b/>
+          <w:bCs/>
+          <w:color w:val="1F3864"/>
+          <w:sz w:val="26"/>
+          <w:szCs w:val="26"/>
+        </w:rPr>
+        <w:t xml:space="preserve">3.3  The Clearing Account</w:t>
+      </w:r>
+    </w:p>
+    <w:p>
+      <w:pPr>
+        <w:spacing w:after="80" w:before="80"/>
+      </w:pPr>
+      <w:r>
+        <w:rPr>
+          <w:rFonts w:ascii="Arial" w:cs="Arial" w:eastAsia="Arial" w:hAnsi="Arial"/>
+          <w:color w:val="1A1A1A"/>
+          <w:sz w:val="22"/>
+          <w:szCs w:val="22"/>
+        </w:rPr>
+        <w:t xml:space="preserve">A dedicated “Sage Payments Clearing” account is maintained in ERPNext for each company — it is created automatically the first time the reconciliation runs. This account is the bridge between the two systems:</w:t>
       </w:r>
     </w:p>
     <w:p>
@@ -2017,7 +1907,7 @@
           <w:sz w:val="22"/>
           <w:szCs w:val="22"/>
         </w:rPr>
-        <w:t xml:space="preserve">Where a delta exists, a single Journal Entry is posted in ERPNext to bring that party’s balance into line with Sage. Where the balances already agree, no journal is created.</w:t>
+        <w:t xml:space="preserve">When a customer pays in Sage, ERPNext never sees that individual payment — but the monthly reconciliation moves the equivalent amount through this clearing account.</w:t>
       </w:r>
     </w:p>
     <w:p>
@@ -2036,7 +1926,7 @@
           <w:sz w:val="22"/>
           <w:szCs w:val="22"/>
         </w:rPr>
-        <w:t xml:space="preserve">Each customer or supplier is reconciled at most once per calendar month. The design deliberately produces one clean reconciliation journal per party per month rather than many small ones: the first time a balance drifts in a given month it is corrected within about a day, and any further drift that same month is picked up at the start of the next month.</w:t>
+        <w:t xml:space="preserve">Every reconciliation journal has one side on the customer or supplier control account (Accounts Receivable or Accounts Payable) and the other side on this clearing account.</w:t>
       </w:r>
     </w:p>
     <w:p>
@@ -2055,6 +1945,164 @@
           <w:sz w:val="22"/>
           <w:szCs w:val="22"/>
         </w:rPr>
+        <w:t xml:space="preserve">Over time, as Sage and ERPNext are kept in alignment, the clearing account nets to zero.</w:t>
+      </w:r>
+    </w:p>
+    <w:p>
+      <w:pPr>
+        <w:spacing w:after="80" w:before="80"/>
+      </w:pPr>
+      <w:r>
+        <w:rPr>
+          <w:rFonts w:ascii="Arial" w:cs="Arial" w:eastAsia="Arial" w:hAnsi="Arial"/>
+          <w:color w:val="1A1A1A"/>
+          <w:sz w:val="22"/>
+          <w:szCs w:val="22"/>
+        </w:rPr>
+        <w:t xml:space="preserve">The clearing account should be reviewed periodically. A persistent balance indicates either a reconciliation that has not yet run, or a discrepancy that needs investigation.</w:t>
+      </w:r>
+    </w:p>
+    <w:p>
+      <w:pPr>
+        <w:pBdr>
+          <w:bottom w:val="single" w:color="5B8DB8" w:sz="4" w:space="4"/>
+        </w:pBdr>
+        <w:spacing w:after="100" w:before="300"/>
+      </w:pPr>
+      <w:r>
+        <w:rPr>
+          <w:rFonts w:ascii="Arial" w:cs="Arial" w:eastAsia="Arial" w:hAnsi="Arial"/>
+          <w:b/>
+          <w:bCs/>
+          <w:color w:val="1F3864"/>
+          <w:sz w:val="26"/>
+          <w:szCs w:val="26"/>
+        </w:rPr>
+        <w:t xml:space="preserve">3.4  Monthly Payment Reconciliation</w:t>
+      </w:r>
+    </w:p>
+    <w:p>
+      <w:pPr>
+        <w:spacing w:after="80" w:before="80"/>
+      </w:pPr>
+      <w:r>
+        <w:rPr>
+          <w:rFonts w:ascii="Arial" w:cs="Arial" w:eastAsia="Arial" w:hAnsi="Arial"/>
+          <w:color w:val="1A1A1A"/>
+          <w:sz w:val="22"/>
+          <w:szCs w:val="22"/>
+        </w:rPr>
+        <w:t xml:space="preserve">Payments — customer receipts, supplier payments, credit note allocations, advance payments — are captured and managed entirely within Sage. ERPNext does not replicate individual payment transactions. Instead, a reconciliation process aligns the closing balances.</w:t>
+      </w:r>
+    </w:p>
+    <w:p>
+      <w:pPr>
+        <w:spacing w:after="40" w:before="200"/>
+      </w:pPr>
+      <w:r>
+        <w:rPr>
+          <w:rFonts w:ascii="Arial" w:cs="Arial" w:eastAsia="Arial" w:hAnsi="Arial"/>
+          <w:b/>
+          <w:bCs/>
+          <w:color w:val="1F3864"/>
+          <w:sz w:val="22"/>
+          <w:szCs w:val="22"/>
+        </w:rPr>
+        <w:t xml:space="preserve">How it works</w:t>
+      </w:r>
+    </w:p>
+    <w:p>
+      <w:pPr>
+        <w:pStyle w:val="ListParagraph"/>
+        <w:numPr>
+          <w:ilvl w:val="0"/>
+          <w:numId w:val="2"/>
+        </w:numPr>
+        <w:spacing w:after="60" w:before="60"/>
+      </w:pPr>
+      <w:r>
+        <w:rPr>
+          <w:rFonts w:ascii="Arial" w:cs="Arial" w:eastAsia="Arial" w:hAnsi="Arial"/>
+          <w:color w:val="1A1A1A"/>
+          <w:sz w:val="22"/>
+          <w:szCs w:val="22"/>
+        </w:rPr>
+        <w:t xml:space="preserve">The reconciliation job runs automatically once a day. Each run asks Sage for the closing balance of every customer and supplier that had activity in the period.</w:t>
+      </w:r>
+    </w:p>
+    <w:p>
+      <w:pPr>
+        <w:pStyle w:val="ListParagraph"/>
+        <w:numPr>
+          <w:ilvl w:val="0"/>
+          <w:numId w:val="2"/>
+        </w:numPr>
+        <w:spacing w:after="60" w:before="60"/>
+      </w:pPr>
+      <w:r>
+        <w:rPr>
+          <w:rFonts w:ascii="Arial" w:cs="Arial" w:eastAsia="Arial" w:hAnsi="Arial"/>
+          <w:color w:val="1A1A1A"/>
+          <w:sz w:val="22"/>
+          <w:szCs w:val="22"/>
+        </w:rPr>
+        <w:t xml:space="preserve">It compares each Sage closing balance against the corresponding outstanding balance in ERPNext. The difference is called the delta.</w:t>
+      </w:r>
+    </w:p>
+    <w:p>
+      <w:pPr>
+        <w:pStyle w:val="ListParagraph"/>
+        <w:numPr>
+          <w:ilvl w:val="0"/>
+          <w:numId w:val="2"/>
+        </w:numPr>
+        <w:spacing w:after="60" w:before="60"/>
+      </w:pPr>
+      <w:r>
+        <w:rPr>
+          <w:rFonts w:ascii="Arial" w:cs="Arial" w:eastAsia="Arial" w:hAnsi="Arial"/>
+          <w:color w:val="1A1A1A"/>
+          <w:sz w:val="22"/>
+          <w:szCs w:val="22"/>
+        </w:rPr>
+        <w:t xml:space="preserve">Where a delta exists, a single Journal Entry is posted in ERPNext to bring that party’s balance into line with Sage. Where the balances already agree, no journal is created.</w:t>
+      </w:r>
+    </w:p>
+    <w:p>
+      <w:pPr>
+        <w:pStyle w:val="ListParagraph"/>
+        <w:numPr>
+          <w:ilvl w:val="0"/>
+          <w:numId w:val="2"/>
+        </w:numPr>
+        <w:spacing w:after="60" w:before="60"/>
+      </w:pPr>
+      <w:r>
+        <w:rPr>
+          <w:rFonts w:ascii="Arial" w:cs="Arial" w:eastAsia="Arial" w:hAnsi="Arial"/>
+          <w:color w:val="1A1A1A"/>
+          <w:sz w:val="22"/>
+          <w:szCs w:val="22"/>
+        </w:rPr>
+        <w:t xml:space="preserve">Each customer or supplier is reconciled at most once per calendar month. The design deliberately produces one clean reconciliation journal per party per month: the first time a balance drifts in a given month it is corrected within about a day, and any further drift that same month is picked up at the start of the next month.</w:t>
+      </w:r>
+    </w:p>
+    <w:p>
+      <w:pPr>
+        <w:pStyle w:val="ListParagraph"/>
+        <w:numPr>
+          <w:ilvl w:val="0"/>
+          <w:numId w:val="2"/>
+        </w:numPr>
+        <w:spacing w:after="60" w:before="60"/>
+      </w:pPr>
+      <w:r>
+        <w:rPr>
+          <w:rFonts w:ascii="Arial" w:cs="Arial" w:eastAsia="Arial" w:hAnsi="Arial"/>
+          <w:color w:val="1A1A1A"/>
+          <w:sz w:val="22"/>
+          <w:szCs w:val="22"/>
+        </w:rPr>
         <w:t xml:space="preserve">Every journal carries a clear reference — for example, SAGE-RECON-BLOMO-CUST-0042-2026-05 (company abbreviation, party, and period) — so it is easy to identify in the ledger.</w:t>
       </w:r>
     </w:p>
@@ -2179,7 +2227,325 @@
           <w:sz w:val="32"/>
           <w:szCs w:val="32"/>
         </w:rPr>
-        <w:t xml:space="preserve">4. Controls and Safeguards</w:t>
+        <w:t xml:space="preserve">4. What Happens When You…</w:t>
+      </w:r>
+    </w:p>
+    <w:p>
+      <w:pPr>
+        <w:spacing w:after="40" w:before="200"/>
+      </w:pPr>
+      <w:r>
+        <w:rPr>
+          <w:rFonts w:ascii="Arial" w:cs="Arial" w:eastAsia="Arial" w:hAnsi="Arial"/>
+          <w:b/>
+          <w:bCs/>
+          <w:color w:val="1F3864"/>
+          <w:sz w:val="22"/>
+          <w:szCs w:val="22"/>
+        </w:rPr>
+        <w:t xml:space="preserve">When you create a Sales Invoice</w:t>
+      </w:r>
+    </w:p>
+    <w:p>
+      <w:pPr>
+        <w:spacing w:after="100" w:before="0"/>
+      </w:pPr>
+      <w:r>
+        <w:rPr>
+          <w:rFonts w:ascii="Arial" w:cs="Arial" w:eastAsia="Arial" w:hAnsi="Arial"/>
+          <w:color w:val="1A1A1A"/>
+          <w:sz w:val="22"/>
+          <w:szCs w:val="22"/>
+        </w:rPr>
+        <w:t xml:space="preserve">Capture and submit it in ERPNext. The integration posts it to Sage automatically within seconds, with the same document number and values. Sage calculates and reports the VAT and holds it as the financial record. The accounts are correct on both sides — there is nothing else to do.</w:t>
+      </w:r>
+    </w:p>
+    <w:p>
+      <w:pPr>
+        <w:spacing w:after="40" w:before="200"/>
+      </w:pPr>
+      <w:r>
+        <w:rPr>
+          <w:rFonts w:ascii="Arial" w:cs="Arial" w:eastAsia="Arial" w:hAnsi="Arial"/>
+          <w:b/>
+          <w:bCs/>
+          <w:color w:val="1F3864"/>
+          <w:sz w:val="22"/>
+          <w:szCs w:val="22"/>
+        </w:rPr>
+        <w:t xml:space="preserve">When you create a Purchase Invoice</w:t>
+      </w:r>
+    </w:p>
+    <w:p>
+      <w:pPr>
+        <w:spacing w:after="100" w:before="0"/>
+      </w:pPr>
+      <w:r>
+        <w:rPr>
+          <w:rFonts w:ascii="Arial" w:cs="Arial" w:eastAsia="Arial" w:hAnsi="Arial"/>
+          <w:color w:val="1A1A1A"/>
+          <w:sz w:val="22"/>
+          <w:szCs w:val="22"/>
+        </w:rPr>
+        <w:t xml:space="preserve">Exactly like a sales invoice: capture and submit it in ERPNext, and it posts to Sage automatically. Sage is the financial record and handles the VAT. No manual re-capture in Sage.</w:t>
+      </w:r>
+    </w:p>
+    <w:p>
+      <w:pPr>
+        <w:spacing w:after="40" w:before="200"/>
+      </w:pPr>
+      <w:r>
+        <w:rPr>
+          <w:rFonts w:ascii="Arial" w:cs="Arial" w:eastAsia="Arial" w:hAnsi="Arial"/>
+          <w:b/>
+          <w:bCs/>
+          <w:color w:val="1F3864"/>
+          <w:sz w:val="22"/>
+          <w:szCs w:val="22"/>
+        </w:rPr>
+        <w:t xml:space="preserve">When you receive a customer payment (or pay a supplier)</w:t>
+      </w:r>
+    </w:p>
+    <w:p>
+      <w:pPr>
+        <w:spacing w:after="100" w:before="0"/>
+      </w:pPr>
+      <w:r>
+        <w:rPr>
+          <w:rFonts w:ascii="Arial" w:cs="Arial" w:eastAsia="Arial" w:hAnsi="Arial"/>
+          <w:color w:val="1A1A1A"/>
+          <w:sz w:val="22"/>
+          <w:szCs w:val="22"/>
+        </w:rPr>
+        <w:t xml:space="preserve">Capture it in Sage — payments, allocations and credit notes live in Sage only. ERPNext does not see the individual payment. At month-end the reconciliation reads that party’s closing balance from Sage and posts a single journal in ERPNext so its debtor or creditor balance matches. You never capture payments in ERPNext.</w:t>
+      </w:r>
+    </w:p>
+    <w:p>
+      <w:pPr>
+        <w:spacing w:after="40" w:before="200"/>
+      </w:pPr>
+      <w:r>
+        <w:rPr>
+          <w:rFonts w:ascii="Arial" w:cs="Arial" w:eastAsia="Arial" w:hAnsi="Arial"/>
+          <w:b/>
+          <w:bCs/>
+          <w:color w:val="1F3864"/>
+          <w:sz w:val="22"/>
+          <w:szCs w:val="22"/>
+        </w:rPr>
+        <w:t xml:space="preserve">When you need to post a journal entry</w:t>
+      </w:r>
+    </w:p>
+    <w:p>
+      <w:pPr>
+        <w:spacing w:after="100" w:before="0"/>
+      </w:pPr>
+      <w:r>
+        <w:rPr>
+          <w:rFonts w:ascii="Arial" w:cs="Arial" w:eastAsia="Arial" w:hAnsi="Arial"/>
+          <w:color w:val="1A1A1A"/>
+          <w:sz w:val="22"/>
+          <w:szCs w:val="22"/>
+        </w:rPr>
+        <w:t xml:space="preserve">Financial journals belong in Sage — it is the ledger. ERPNext posts its own journals where it needs to (for stock movements, and for the monthly balance reconciliation), but you should not be capturing financial journals in ERPNext by hand. If in doubt, post it in Sage.</w:t>
+      </w:r>
+    </w:p>
+    <w:p>
+      <w:pPr>
+        <w:spacing w:after="40" w:before="200"/>
+      </w:pPr>
+      <w:r>
+        <w:rPr>
+          <w:rFonts w:ascii="Arial" w:cs="Arial" w:eastAsia="Arial" w:hAnsi="Arial"/>
+          <w:b/>
+          <w:bCs/>
+          <w:color w:val="1F3864"/>
+          <w:sz w:val="22"/>
+          <w:szCs w:val="22"/>
+        </w:rPr>
+        <w:t xml:space="preserve">When you capture an invoice directly in Sage instead of ERPNext</w:t>
+      </w:r>
+    </w:p>
+    <w:p>
+      <w:pPr>
+        <w:spacing w:after="100" w:before="0"/>
+      </w:pPr>
+      <w:r>
+        <w:rPr>
+          <w:rFonts w:ascii="Arial" w:cs="Arial" w:eastAsia="Arial" w:hAnsi="Arial"/>
+          <w:color w:val="1A1A1A"/>
+          <w:sz w:val="22"/>
+          <w:szCs w:val="22"/>
+        </w:rPr>
+        <w:t xml:space="preserve">This is fine for a service invoice with no stock — the monthly reconciliation picks up the balance change and aligns ERPNext automatically. It is NOT fine for anything involving physical stock: ERPNext would never see the stock movement and your stock figures would be wrong. Rule of thumb: if it touches stock, it must start in ERPNext.</w:t>
+      </w:r>
+    </w:p>
+    <w:p>
+      <w:pPr>
+        <w:spacing w:after="40" w:before="200"/>
+      </w:pPr>
+      <w:r>
+        <w:rPr>
+          <w:rFonts w:ascii="Arial" w:cs="Arial" w:eastAsia="Arial" w:hAnsi="Arial"/>
+          <w:b/>
+          <w:bCs/>
+          <w:color w:val="1F3864"/>
+          <w:sz w:val="22"/>
+          <w:szCs w:val="22"/>
+        </w:rPr>
+        <w:t xml:space="preserve">When you do a stock adjustment or stock count in ERPNext</w:t>
+      </w:r>
+    </w:p>
+    <w:p>
+      <w:pPr>
+        <w:spacing w:after="100" w:before="0"/>
+      </w:pPr>
+      <w:r>
+        <w:rPr>
+          <w:rFonts w:ascii="Arial" w:cs="Arial" w:eastAsia="Arial" w:hAnsi="Arial"/>
+          <w:color w:val="1A1A1A"/>
+          <w:sz w:val="22"/>
+          <w:szCs w:val="22"/>
+        </w:rPr>
+        <w:t xml:space="preserve">ERPNext records the stock movement and works out the accounting effect itself, then posts a matching journal to Sage so the stock-value accounts agree on both sides. Nothing to do in Sage.</w:t>
+      </w:r>
+    </w:p>
+    <w:p>
+      <w:pPr>
+        <w:spacing w:after="40" w:before="200"/>
+      </w:pPr>
+      <w:r>
+        <w:rPr>
+          <w:rFonts w:ascii="Arial" w:cs="Arial" w:eastAsia="Arial" w:hAnsi="Arial"/>
+          <w:b/>
+          <w:bCs/>
+          <w:color w:val="1F3864"/>
+          <w:sz w:val="22"/>
+          <w:szCs w:val="22"/>
+        </w:rPr>
+        <w:t xml:space="preserve">When you cancel a Sales Order or Purchase Order</w:t>
+      </w:r>
+    </w:p>
+    <w:p>
+      <w:pPr>
+        <w:spacing w:after="100" w:before="0"/>
+      </w:pPr>
+      <w:r>
+        <w:rPr>
+          <w:rFonts w:ascii="Arial" w:cs="Arial" w:eastAsia="Arial" w:hAnsi="Arial"/>
+          <w:color w:val="1A1A1A"/>
+          <w:sz w:val="22"/>
+          <w:szCs w:val="22"/>
+        </w:rPr>
+        <w:t xml:space="preserve">Cancel it in ERPNext. The integration marks the matching document in Sage as cancelled at the same time — there is no need to cancel it in Sage as well.</w:t>
+      </w:r>
+    </w:p>
+    <w:p>
+      <w:pPr>
+        <w:spacing w:after="40" w:before="200"/>
+      </w:pPr>
+      <w:r>
+        <w:rPr>
+          <w:rFonts w:ascii="Arial" w:cs="Arial" w:eastAsia="Arial" w:hAnsi="Arial"/>
+          <w:b/>
+          <w:bCs/>
+          <w:color w:val="1F3864"/>
+          <w:sz w:val="22"/>
+          <w:szCs w:val="22"/>
+        </w:rPr>
+        <w:t xml:space="preserve">When you run a VAT return or a SARS submission</w:t>
+      </w:r>
+    </w:p>
+    <w:p>
+      <w:pPr>
+        <w:spacing w:after="100" w:before="0"/>
+      </w:pPr>
+      <w:r>
+        <w:rPr>
+          <w:rFonts w:ascii="Arial" w:cs="Arial" w:eastAsia="Arial" w:hAnsi="Arial"/>
+          <w:color w:val="1A1A1A"/>
+          <w:sz w:val="22"/>
+          <w:szCs w:val="22"/>
+        </w:rPr>
+        <w:t xml:space="preserve">Entirely in Sage. Sage holds the statutory books and the tax periods; ERPNext plays no part in statutory submissions.</w:t>
+      </w:r>
+    </w:p>
+    <w:p>
+      <w:pPr>
+        <w:spacing w:after="40" w:before="200"/>
+      </w:pPr>
+      <w:r>
+        <w:rPr>
+          <w:rFonts w:ascii="Arial" w:cs="Arial" w:eastAsia="Arial" w:hAnsi="Arial"/>
+          <w:b/>
+          <w:bCs/>
+          <w:color w:val="1F3864"/>
+          <w:sz w:val="22"/>
+          <w:szCs w:val="22"/>
+        </w:rPr>
+        <w:t xml:space="preserve">When you want a debtor age analysis, cash-flow view or management report</w:t>
+      </w:r>
+    </w:p>
+    <w:p>
+      <w:pPr>
+        <w:spacing w:after="100" w:before="0"/>
+      </w:pPr>
+      <w:r>
+        <w:rPr>
+          <w:rFonts w:ascii="Arial" w:cs="Arial" w:eastAsia="Arial" w:hAnsi="Arial"/>
+          <w:color w:val="1A1A1A"/>
+          <w:sz w:val="22"/>
+          <w:szCs w:val="22"/>
+        </w:rPr>
+        <w:t xml:space="preserve">Run it from ERPNext. Once the month’s reconciliation has run, ERPNext’s customer and supplier balances match Sage, so management reports — including consolidated multi-company views — are built on accurate figures.</w:t>
+      </w:r>
+    </w:p>
+    <w:p>
+      <w:pPr>
+        <w:spacing w:after="40" w:before="200"/>
+      </w:pPr>
+      <w:r>
+        <w:rPr>
+          <w:rFonts w:ascii="Arial" w:cs="Arial" w:eastAsia="Arial" w:hAnsi="Arial"/>
+          <w:b/>
+          <w:bCs/>
+          <w:color w:val="1F3864"/>
+          <w:sz w:val="22"/>
+          <w:szCs w:val="22"/>
+        </w:rPr>
+        <w:t xml:space="preserve">When you reach month-end and want to know the accounts are right</w:t>
+      </w:r>
+    </w:p>
+    <w:p>
+      <w:pPr>
+        <w:spacing w:after="100" w:before="0"/>
+      </w:pPr>
+      <w:r>
+        <w:rPr>
+          <w:rFonts w:ascii="Arial" w:cs="Arial" w:eastAsia="Arial" w:hAnsi="Arial"/>
+          <w:color w:val="1A1A1A"/>
+          <w:sz w:val="22"/>
+          <w:szCs w:val="22"/>
+        </w:rPr>
+        <w:t xml:space="preserve">Check that the month’s reconciliation has run, and that the “Sage Payments Clearing” account nets to zero. A zero clearing balance means Sage and ERPNext agree. An unexplained balance there is the one thing worth investigating before you close the period.</w:t>
+      </w:r>
+    </w:p>
+    <w:p>
+      <w:pPr>
+        <w:shd w:fill="1F3864" w:color="auto" w:val="clear"/>
+        <w:spacing w:after="120" w:before="360"/>
+        <w:ind w:left="180" w:right="180"/>
+      </w:pPr>
+      <w:r>
+        <w:rPr>
+          <w:rFonts w:ascii="Arial" w:cs="Arial" w:eastAsia="Arial" w:hAnsi="Arial"/>
+          <w:b/>
+          <w:bCs/>
+          <w:color w:val="FFFFFF"/>
+          <w:sz w:val="32"/>
+          <w:szCs w:val="32"/>
+        </w:rPr>
+        <w:t xml:space="preserve">5. Controls and Safeguards</w:t>
       </w:r>
     </w:p>
     <w:tbl>
@@ -2724,7 +3090,7 @@
                 <w:sz w:val="20"/>
                 <w:szCs w:val="20"/>
               </w:rPr>
-              <w:t xml:space="preserve">Each sync type (Sales Orders, Purchase Orders, Stock Adjustments, Reconciliation) has an on/off toggle in the system settings. Any sync can be paused without affecting the others.</w:t>
+              <w:t xml:space="preserve">Each sync type (Sales Orders, Purchase Orders, Stock Adjustments, Reconciliation, Category sync) has an on/off toggle in the system settings. Any sync can be paused without affecting the others.</w:t>
             </w:r>
           </w:p>
         </w:tc>
@@ -2745,7 +3111,7 @@
           <w:sz w:val="32"/>
           <w:szCs w:val="32"/>
         </w:rPr>
-        <w:t xml:space="preserve">5. What the Accountant Needs to Do</w:t>
+        <w:t xml:space="preserve">6. What the Accountant Needs to Do</w:t>
       </w:r>
     </w:p>
     <w:p>
@@ -2794,7 +3160,7 @@
           <w:sz w:val="22"/>
           <w:szCs w:val="22"/>
         </w:rPr>
-        <w:t xml:space="preserve">Create a leaf account named exactly “Sage Payments Clearing” on the company’s chart of accounts. Confirm its name and placement before the first run — the reconciliation job looks for this exact account name.</w:t>
+        <w:t xml:space="preserve">Confirm the company has its default Accounts Receivable and Accounts Payable accounts set. The “Sage Payments Clearing” account is created automatically — no manual setup needed.</w:t>
       </w:r>
     </w:p>
     <w:p>
@@ -2813,7 +3179,7 @@
           <w:sz w:val="22"/>
           <w:szCs w:val="22"/>
         </w:rPr>
-        <w:t xml:space="preserve">Confirm the company has its default Accounts Receivable and Accounts Payable accounts set.</w:t>
+        <w:t xml:space="preserve">Agree the opening date for the very first reconciliation run. On a company with existing history this is normally the start of the current financial year; left blank, it defaults to the financial year start.</w:t>
       </w:r>
     </w:p>
     <w:p>
@@ -2832,7 +3198,23 @@
           <w:sz w:val="22"/>
           <w:szCs w:val="22"/>
         </w:rPr>
-        <w:t xml:space="preserve">Agree the opening date for the very first reconciliation run. On a company with existing history this is normally the start of the current financial year; it sets how far back the first run reaches.</w:t>
+        <w:t xml:space="preserve">Once the integration endpoints are live, switch on the “Run Reconciliation Sync” toggle in Erpnext Sbca Settings. It is off by default.</w:t>
+      </w:r>
+    </w:p>
+    <w:p>
+      <w:pPr>
+        <w:spacing w:after="40" w:before="200"/>
+      </w:pPr>
+      <w:r>
+        <w:rPr>
+          <w:rFonts w:ascii="Arial" w:cs="Arial" w:eastAsia="Arial" w:hAnsi="Arial"/>
+          <w:b/>
+          <w:bCs/>
+          <w:color w:val="1F3864"/>
+          <w:sz w:val="22"/>
+          <w:szCs w:val="22"/>
+        </w:rPr>
+        <w:t xml:space="preserve">Monthly</w:t>
       </w:r>
     </w:p>
     <w:p>
@@ -2851,23 +3233,7 @@
           <w:sz w:val="22"/>
           <w:szCs w:val="22"/>
         </w:rPr>
-        <w:t xml:space="preserve">Once the integration endpoints are live, switch on the “Run Reconciliation Sync” toggle in Erpnext Sbca Settings. It is off by default.</w:t>
-      </w:r>
-    </w:p>
-    <w:p>
-      <w:pPr>
-        <w:spacing w:after="40" w:before="200"/>
-      </w:pPr>
-      <w:r>
-        <w:rPr>
-          <w:rFonts w:ascii="Arial" w:cs="Arial" w:eastAsia="Arial" w:hAnsi="Arial"/>
-          <w:b/>
-          <w:bCs/>
-          <w:color w:val="1F3864"/>
-          <w:sz w:val="22"/>
-          <w:szCs w:val="22"/>
-        </w:rPr>
-        <w:t xml:space="preserve">Monthly</w:t>
+        <w:t xml:space="preserve">Confirm the reconciliation has run for the period — check the Sage Reconciliation Log for the current period (e.g. 2026-05) and that journals show a status of Created.</w:t>
       </w:r>
     </w:p>
     <w:p>
@@ -2886,7 +3252,7 @@
           <w:sz w:val="22"/>
           <w:szCs w:val="22"/>
         </w:rPr>
-        <w:t xml:space="preserve">Confirm the reconciliation has run for the period — check the Sage Reconciliation Log for the current period (e.g. 2026-05) and that journals show a status of Created.</w:t>
+        <w:t xml:space="preserve">Review the Sage Payments Clearing account balance — it should be approaching zero after reconciliation.</w:t>
       </w:r>
     </w:p>
     <w:p>
@@ -2905,7 +3271,23 @@
           <w:sz w:val="22"/>
           <w:szCs w:val="22"/>
         </w:rPr>
-        <w:t xml:space="preserve">Review the Sage Payments Clearing account balance — it should be approaching zero after reconciliation.</w:t>
+        <w:t xml:space="preserve">Investigate any Failed rows in the Sage Reconciliation Log, and any ERPNext documents flagged with a sync error — resolve the cause and let the next run retry, or escalate.</w:t>
+      </w:r>
+    </w:p>
+    <w:p>
+      <w:pPr>
+        <w:spacing w:after="40" w:before="200"/>
+      </w:pPr>
+      <w:r>
+        <w:rPr>
+          <w:rFonts w:ascii="Arial" w:cs="Arial" w:eastAsia="Arial" w:hAnsi="Arial"/>
+          <w:b/>
+          <w:bCs/>
+          <w:color w:val="1F3864"/>
+          <w:sz w:val="22"/>
+          <w:szCs w:val="22"/>
+        </w:rPr>
+        <w:t xml:space="preserve">Process discipline</w:t>
       </w:r>
     </w:p>
     <w:p>
@@ -2924,23 +3306,7 @@
           <w:sz w:val="22"/>
           <w:szCs w:val="22"/>
         </w:rPr>
-        <w:t xml:space="preserve">Investigate any Failed rows in the Sage Reconciliation Log, and any ERPNext documents flagged with a sync error — resolve the cause and let the next run retry, or escalate.</w:t>
-      </w:r>
-    </w:p>
-    <w:p>
-      <w:pPr>
-        <w:spacing w:after="40" w:before="200"/>
-      </w:pPr>
-      <w:r>
-        <w:rPr>
-          <w:rFonts w:ascii="Arial" w:cs="Arial" w:eastAsia="Arial" w:hAnsi="Arial"/>
-          <w:b/>
-          <w:bCs/>
-          <w:color w:val="1F3864"/>
-          <w:sz w:val="22"/>
-          <w:szCs w:val="22"/>
-        </w:rPr>
-        <w:t xml:space="preserve">Process discipline</w:t>
+        <w:t xml:space="preserve">All transactions involving physical stock must be initiated in ERPNext. Do not capture stock-item invoices directly in Sage.</w:t>
       </w:r>
     </w:p>
     <w:p>
@@ -2959,7 +3325,7 @@
           <w:sz w:val="22"/>
           <w:szCs w:val="22"/>
         </w:rPr>
-        <w:t xml:space="preserve">All transactions involving physical stock must be initiated in ERPNext. Do not capture stock-item invoices directly in Sage.</w:t>
+        <w:t xml:space="preserve">Service-only invoices (no stock movement) may be captured directly in Sage if needed — the monthly reconciliation will align the financial impact.</w:t>
       </w:r>
     </w:p>
     <w:p>
@@ -2978,7 +3344,23 @@
           <w:sz w:val="22"/>
           <w:szCs w:val="22"/>
         </w:rPr>
-        <w:t xml:space="preserve">Service-only invoices (no stock movement) may be captured directly in Sage if needed — the monthly reconciliation will align the financial impact.</w:t>
+        <w:t xml:space="preserve">Payments, allocations, and credit notes are captured in Sage only. Do not create payment entries in ERPNext.</w:t>
+      </w:r>
+    </w:p>
+    <w:p>
+      <w:pPr>
+        <w:spacing w:after="40" w:before="200"/>
+      </w:pPr>
+      <w:r>
+        <w:rPr>
+          <w:rFonts w:ascii="Arial" w:cs="Arial" w:eastAsia="Arial" w:hAnsi="Arial"/>
+          <w:b/>
+          <w:bCs/>
+          <w:color w:val="1F3864"/>
+          <w:sz w:val="22"/>
+          <w:szCs w:val="22"/>
+        </w:rPr>
+        <w:t xml:space="preserve">Correcting a reconciliation entry</w:t>
       </w:r>
     </w:p>
     <w:p>
@@ -2997,23 +3379,7 @@
           <w:sz w:val="22"/>
           <w:szCs w:val="22"/>
         </w:rPr>
-        <w:t xml:space="preserve">Payments, allocations, and credit notes are captured in Sage only. Do not create payment entries in ERPNext.</w:t>
-      </w:r>
-    </w:p>
-    <w:p>
-      <w:pPr>
-        <w:spacing w:after="40" w:before="200"/>
-      </w:pPr>
-      <w:r>
-        <w:rPr>
-          <w:rFonts w:ascii="Arial" w:cs="Arial" w:eastAsia="Arial" w:hAnsi="Arial"/>
-          <w:b/>
-          <w:bCs/>
-          <w:color w:val="1F3864"/>
-          <w:sz w:val="22"/>
-          <w:szCs w:val="22"/>
-        </w:rPr>
-        <w:t xml:space="preserve">Correcting a reconciliation entry</w:t>
+        <w:t xml:space="preserve">A reconciliation journal can be cancelled in ERPNext like any Journal Entry if it is wrong.</w:t>
       </w:r>
     </w:p>
     <w:p>
@@ -3032,7 +3398,23 @@
           <w:sz w:val="22"/>
           <w:szCs w:val="22"/>
         </w:rPr>
-        <w:t xml:space="preserve">A reconciliation journal can be cancelled in ERPNext like any Journal Entry if it is wrong.</w:t>
+        <w:t xml:space="preserve">If you cancel one, also delete or amend its row in the Sage Reconciliation Log. Otherwise the daily job sees the existing “Created” row and will not post a replacement for that party and period.</w:t>
+      </w:r>
+    </w:p>
+    <w:p>
+      <w:pPr>
+        <w:spacing w:after="40" w:before="200"/>
+      </w:pPr>
+      <w:r>
+        <w:rPr>
+          <w:rFonts w:ascii="Arial" w:cs="Arial" w:eastAsia="Arial" w:hAnsi="Arial"/>
+          <w:b/>
+          <w:bCs/>
+          <w:color w:val="1F3864"/>
+          <w:sz w:val="22"/>
+          <w:szCs w:val="22"/>
+        </w:rPr>
+        <w:t xml:space="preserve">Period-end</w:t>
       </w:r>
     </w:p>
     <w:p>
@@ -3051,23 +3433,7 @@
           <w:sz w:val="22"/>
           <w:szCs w:val="22"/>
         </w:rPr>
-        <w:t xml:space="preserve">If you cancel one, also delete or amend its row in the Sage Reconciliation Log. Otherwise the daily job sees the existing “Created” row and will not post a replacement for that party and period.</w:t>
-      </w:r>
-    </w:p>
-    <w:p>
-      <w:pPr>
-        <w:spacing w:after="40" w:before="200"/>
-      </w:pPr>
-      <w:r>
-        <w:rPr>
-          <w:rFonts w:ascii="Arial" w:cs="Arial" w:eastAsia="Arial" w:hAnsi="Arial"/>
-          <w:b/>
-          <w:bCs/>
-          <w:color w:val="1F3864"/>
-          <w:sz w:val="22"/>
-          <w:szCs w:val="22"/>
-        </w:rPr>
-        <w:t xml:space="preserve">Period-end</w:t>
+        <w:t xml:space="preserve">Before closing a financial period in Sage, confirm the reconciliation for that period has completed successfully in ERPNext.</w:t>
       </w:r>
     </w:p>
     <w:p>
@@ -3086,7 +3452,39 @@
           <w:sz w:val="22"/>
           <w:szCs w:val="22"/>
         </w:rPr>
-        <w:t xml:space="preserve">Before closing a financial period in Sage, confirm the reconciliation for that period has completed successfully in ERPNext.</w:t>
+        <w:t xml:space="preserve">The Sage Payments Clearing account should net to zero at period end. An unexplained balance warrants investigation before the period is closed.</w:t>
+      </w:r>
+    </w:p>
+    <w:p>
+      <w:pPr>
+        <w:shd w:fill="1F3864" w:color="auto" w:val="clear"/>
+        <w:spacing w:after="120" w:before="360"/>
+        <w:ind w:left="180" w:right="180"/>
+      </w:pPr>
+      <w:r>
+        <w:rPr>
+          <w:rFonts w:ascii="Arial" w:cs="Arial" w:eastAsia="Arial" w:hAnsi="Arial"/>
+          <w:b/>
+          <w:bCs/>
+          <w:color w:val="FFFFFF"/>
+          <w:sz w:val="32"/>
+          <w:szCs w:val="32"/>
+        </w:rPr>
+        <w:t xml:space="preserve">7. What Stays in Sage</w:t>
+      </w:r>
+    </w:p>
+    <w:p>
+      <w:pPr>
+        <w:spacing w:after="80" w:before="80"/>
+      </w:pPr>
+      <w:r>
+        <w:rPr>
+          <w:rFonts w:ascii="Arial" w:cs="Arial" w:eastAsia="Arial" w:hAnsi="Arial"/>
+          <w:color w:val="1A1A1A"/>
+          <w:sz w:val="22"/>
+          <w:szCs w:val="22"/>
+        </w:rPr>
+        <w:t xml:space="preserve">The following financial activities are managed exclusively in Sage and are not replicated into ERPNext at a transaction level:</w:t>
       </w:r>
     </w:p>
     <w:p>
@@ -3105,39 +3503,7 @@
           <w:sz w:val="22"/>
           <w:szCs w:val="22"/>
         </w:rPr>
-        <w:t xml:space="preserve">The Sage Payments Clearing account should net to zero at period end. An unexplained balance warrants investigation before the period is closed.</w:t>
-      </w:r>
-    </w:p>
-    <w:p>
-      <w:pPr>
-        <w:shd w:fill="1F3864" w:color="auto" w:val="clear"/>
-        <w:spacing w:after="120" w:before="360"/>
-        <w:ind w:left="180" w:right="180"/>
-      </w:pPr>
-      <w:r>
-        <w:rPr>
-          <w:rFonts w:ascii="Arial" w:cs="Arial" w:eastAsia="Arial" w:hAnsi="Arial"/>
-          <w:b/>
-          <w:bCs/>
-          <w:color w:val="FFFFFF"/>
-          <w:sz w:val="32"/>
-          <w:szCs w:val="32"/>
-        </w:rPr>
-        <w:t xml:space="preserve">6. What Stays in Sage</w:t>
-      </w:r>
-    </w:p>
-    <w:p>
-      <w:pPr>
-        <w:spacing w:after="80" w:before="80"/>
-      </w:pPr>
-      <w:r>
-        <w:rPr>
-          <w:rFonts w:ascii="Arial" w:cs="Arial" w:eastAsia="Arial" w:hAnsi="Arial"/>
-          <w:color w:val="1A1A1A"/>
-          <w:sz w:val="22"/>
-          <w:szCs w:val="22"/>
-        </w:rPr>
-        <w:t xml:space="preserve">The following financial activities are managed exclusively in Sage and are not replicated into ERPNext at a transaction level:</w:t>
+        <w:t xml:space="preserve">Customer receipts and supplier payments</w:t>
       </w:r>
     </w:p>
     <w:p>
@@ -3156,7 +3522,7 @@
           <w:sz w:val="22"/>
           <w:szCs w:val="22"/>
         </w:rPr>
-        <w:t xml:space="preserve">Customer receipts and supplier payments</w:t>
+        <w:t xml:space="preserve">Credit note allocations and contra entries</w:t>
       </w:r>
     </w:p>
     <w:p>
@@ -3175,7 +3541,7 @@
           <w:sz w:val="22"/>
           <w:szCs w:val="22"/>
         </w:rPr>
-        <w:t xml:space="preserve">Credit note allocations and contra entries</w:t>
+        <w:t xml:space="preserve">Bank accounts and bank reconciliation</w:t>
       </w:r>
     </w:p>
     <w:p>
@@ -3194,7 +3560,7 @@
           <w:sz w:val="22"/>
           <w:szCs w:val="22"/>
         </w:rPr>
-        <w:t xml:space="preserve">Bank accounts and bank reconciliation</w:t>
+        <w:t xml:space="preserve">VAT submissions and tax period processing</w:t>
       </w:r>
     </w:p>
     <w:p>
@@ -3213,7 +3579,7 @@
           <w:sz w:val="22"/>
           <w:szCs w:val="22"/>
         </w:rPr>
-        <w:t xml:space="preserve">VAT submissions and tax period processing</w:t>
+        <w:t xml:space="preserve">SARS-compliant statutory reporting</w:t>
       </w:r>
     </w:p>
     <w:p>
@@ -3232,7 +3598,341 @@
           <w:sz w:val="22"/>
           <w:szCs w:val="22"/>
         </w:rPr>
-        <w:t xml:space="preserve">SARS-compliant statutory reporting</w:t>
+        <w:t xml:space="preserve">Year-end close procedures</w:t>
+      </w:r>
+    </w:p>
+    <w:p>
+      <w:pPr>
+        <w:spacing w:after="80" w:before="80"/>
+      </w:pPr>
+      <w:r>
+        <w:rPr>
+          <w:rFonts w:ascii="Arial" w:cs="Arial" w:eastAsia="Arial" w:hAnsi="Arial"/>
+          <w:color w:val="1A1A1A"/>
+          <w:sz w:val="22"/>
+          <w:szCs w:val="22"/>
+        </w:rPr>
+        <w:t xml:space="preserve">ERPNext reflects the net result of these activities through the monthly balance reconciliation — it sees the outcome (aligned closing balances) rather than the individual transactions. Note that the reconciliation aligns customer and supplier balances only; bank, cash, and other general-ledger accounts are not reconciled by this process and remain Sage’s domain.</w:t>
+      </w:r>
+    </w:p>
+    <w:p>
+      <w:pPr>
+        <w:shd w:fill="1F3864" w:color="auto" w:val="clear"/>
+        <w:spacing w:after="120" w:before="360"/>
+        <w:ind w:left="180" w:right="180"/>
+      </w:pPr>
+      <w:r>
+        <w:rPr>
+          <w:rFonts w:ascii="Arial" w:cs="Arial" w:eastAsia="Arial" w:hAnsi="Arial"/>
+          <w:b/>
+          <w:bCs/>
+          <w:color w:val="FFFFFF"/>
+          <w:sz w:val="32"/>
+          <w:szCs w:val="32"/>
+        </w:rPr>
+        <w:t xml:space="preserve">8. Common Questions</w:t>
+      </w:r>
+    </w:p>
+    <w:p>
+      <w:pPr>
+        <w:spacing w:after="40" w:before="200"/>
+      </w:pPr>
+      <w:r>
+        <w:rPr>
+          <w:rFonts w:ascii="Arial" w:cs="Arial" w:eastAsia="Arial" w:hAnsi="Arial"/>
+          <w:b/>
+          <w:bCs/>
+          <w:color w:val="1F3864"/>
+          <w:sz w:val="22"/>
+          <w:szCs w:val="22"/>
+        </w:rPr>
+        <w:t xml:space="preserve">How often does the reconciliation actually run?</w:t>
+      </w:r>
+    </w:p>
+    <w:p>
+      <w:pPr>
+        <w:spacing w:after="100" w:before="0"/>
+      </w:pPr>
+      <w:r>
+        <w:rPr>
+          <w:rFonts w:ascii="Arial" w:cs="Arial" w:eastAsia="Arial" w:hAnsi="Arial"/>
+          <w:color w:val="1A1A1A"/>
+          <w:sz w:val="22"/>
+          <w:szCs w:val="22"/>
+        </w:rPr>
+        <w:t xml:space="preserve">The job runs once a day. But because each customer and supplier is reconciled at most once per calendar month, the practical effect is monthly: the first time a party’s balance drifts in a month it is corrected within about a day, and any further drift that same month is picked up at the start of the next month. This is deliberate — it keeps one clean reconciliation journal per party per month rather than a stream of small ones.</w:t>
+      </w:r>
+    </w:p>
+    <w:p>
+      <w:pPr>
+        <w:spacing w:after="40" w:before="200"/>
+      </w:pPr>
+      <w:r>
+        <w:rPr>
+          <w:rFonts w:ascii="Arial" w:cs="Arial" w:eastAsia="Arial" w:hAnsi="Arial"/>
+          <w:b/>
+          <w:bCs/>
+          <w:color w:val="1F3864"/>
+          <w:sz w:val="22"/>
+          <w:szCs w:val="22"/>
+        </w:rPr>
+        <w:t xml:space="preserve">Why did a customer’s balance go up after reconciliation?</w:t>
+      </w:r>
+    </w:p>
+    <w:p>
+      <w:pPr>
+        <w:spacing w:after="100" w:before="0"/>
+      </w:pPr>
+      <w:r>
+        <w:rPr>
+          <w:rFonts w:ascii="Arial" w:cs="Arial" w:eastAsia="Arial" w:hAnsi="Arial"/>
+          <w:color w:val="1A1A1A"/>
+          <w:sz w:val="22"/>
+          <w:szCs w:val="22"/>
+        </w:rPr>
+        <w:t xml:space="preserve">Usually reconciliation reduces a customer’s balance, because the customer has paid in Sage and ERPNext did not know. But if an invoice was captured directly in Sage, ERPNext’s balance was too low — so the journal increases it instead. The direction always follows Sage: ERPNext is moved to wherever Sage’s closing balance sits.</w:t>
+      </w:r>
+    </w:p>
+    <w:p>
+      <w:pPr>
+        <w:spacing w:after="40" w:before="200"/>
+      </w:pPr>
+      <w:r>
+        <w:rPr>
+          <w:rFonts w:ascii="Arial" w:cs="Arial" w:eastAsia="Arial" w:hAnsi="Arial"/>
+          <w:b/>
+          <w:bCs/>
+          <w:color w:val="1F3864"/>
+          <w:sz w:val="22"/>
+          <w:szCs w:val="22"/>
+        </w:rPr>
+        <w:t xml:space="preserve">Do reconciliation journals affect VAT?</w:t>
+      </w:r>
+    </w:p>
+    <w:p>
+      <w:pPr>
+        <w:spacing w:after="100" w:before="0"/>
+      </w:pPr>
+      <w:r>
+        <w:rPr>
+          <w:rFonts w:ascii="Arial" w:cs="Arial" w:eastAsia="Arial" w:hAnsi="Arial"/>
+          <w:color w:val="1A1A1A"/>
+          <w:sz w:val="22"/>
+          <w:szCs w:val="22"/>
+        </w:rPr>
+        <w:t xml:space="preserve">No. A reconciliation journal posts between a control account (Accounts Receivable or Accounts Payable) and the Sage Payments Clearing account, with no tax lines. VAT, tax periods, and SARS submissions remain entirely in Sage.</w:t>
+      </w:r>
+    </w:p>
+    <w:p>
+      <w:pPr>
+        <w:spacing w:after="40" w:before="200"/>
+      </w:pPr>
+      <w:r>
+        <w:rPr>
+          <w:rFonts w:ascii="Arial" w:cs="Arial" w:eastAsia="Arial" w:hAnsi="Arial"/>
+          <w:b/>
+          <w:bCs/>
+          <w:color w:val="1F3864"/>
+          <w:sz w:val="22"/>
+          <w:szCs w:val="22"/>
+        </w:rPr>
+        <w:t xml:space="preserve">What if a customer or supplier in Sage has no match in ERPNext?</w:t>
+      </w:r>
+    </w:p>
+    <w:p>
+      <w:pPr>
+        <w:spacing w:after="100" w:before="0"/>
+      </w:pPr>
+      <w:r>
+        <w:rPr>
+          <w:rFonts w:ascii="Arial" w:cs="Arial" w:eastAsia="Arial" w:hAnsi="Arial"/>
+          <w:color w:val="1A1A1A"/>
+          <w:sz w:val="22"/>
+          <w:szCs w:val="22"/>
+        </w:rPr>
+        <w:t xml:space="preserve">That party is skipped for the run and noted in the logs — no journal is posted. Once the matching customer or supplier exists in ERPNext (it will usually sync across from Sage automatically), the next reconciliation run picks it up.</w:t>
+      </w:r>
+    </w:p>
+    <w:p>
+      <w:pPr>
+        <w:spacing w:after="40" w:before="200"/>
+      </w:pPr>
+      <w:r>
+        <w:rPr>
+          <w:rFonts w:ascii="Arial" w:cs="Arial" w:eastAsia="Arial" w:hAnsi="Arial"/>
+          <w:b/>
+          <w:bCs/>
+          <w:color w:val="1F3864"/>
+          <w:sz w:val="22"/>
+          <w:szCs w:val="22"/>
+        </w:rPr>
+        <w:t xml:space="preserve">Can a reconciliation journal be reversed or corrected?</w:t>
+      </w:r>
+    </w:p>
+    <w:p>
+      <w:pPr>
+        <w:spacing w:after="100" w:before="0"/>
+      </w:pPr>
+      <w:r>
+        <w:rPr>
+          <w:rFonts w:ascii="Arial" w:cs="Arial" w:eastAsia="Arial" w:hAnsi="Arial"/>
+          <w:color w:val="1A1A1A"/>
+          <w:sz w:val="22"/>
+          <w:szCs w:val="22"/>
+        </w:rPr>
+        <w:t xml:space="preserve">Yes — cancel the Journal Entry in ERPNext as you would any journal. Important: also delete or amend the matching row in the Sage Reconciliation Log. If the “Created” log row is left in place, the daily job treats that party and period as already done and will not post a replacement.</w:t>
+      </w:r>
+    </w:p>
+    <w:p>
+      <w:pPr>
+        <w:spacing w:after="40" w:before="200"/>
+      </w:pPr>
+      <w:r>
+        <w:rPr>
+          <w:rFonts w:ascii="Arial" w:cs="Arial" w:eastAsia="Arial" w:hAnsi="Arial"/>
+          <w:b/>
+          <w:bCs/>
+          <w:color w:val="1F3864"/>
+          <w:sz w:val="22"/>
+          <w:szCs w:val="22"/>
+        </w:rPr>
+        <w:t xml:space="preserve">What happens if Sage cannot be reached on a given day?</w:t>
+      </w:r>
+    </w:p>
+    <w:p>
+      <w:pPr>
+        <w:spacing w:after="100" w:before="0"/>
+      </w:pPr>
+      <w:r>
+        <w:rPr>
+          <w:rFonts w:ascii="Arial" w:cs="Arial" w:eastAsia="Arial" w:hAnsi="Arial"/>
+          <w:color w:val="1A1A1A"/>
+          <w:sz w:val="22"/>
+          <w:szCs w:val="22"/>
+        </w:rPr>
+        <w:t xml:space="preserve">That company is skipped for that run, the failure is logged, and the “last reconciliation” marker is not advanced — so the next run simply repeats the same period. Nothing is lost or double-counted, because the Sage Reconciliation Log keeps the process idempotent.</w:t>
+      </w:r>
+    </w:p>
+    <w:p>
+      <w:pPr>
+        <w:spacing w:after="40" w:before="200"/>
+      </w:pPr>
+      <w:r>
+        <w:rPr>
+          <w:rFonts w:ascii="Arial" w:cs="Arial" w:eastAsia="Arial" w:hAnsi="Arial"/>
+          <w:b/>
+          <w:bCs/>
+          <w:color w:val="1F3864"/>
+          <w:sz w:val="22"/>
+          <w:szCs w:val="22"/>
+        </w:rPr>
+        <w:t xml:space="preserve">Which balances does the reconciliation actually align?</w:t>
+      </w:r>
+    </w:p>
+    <w:p>
+      <w:pPr>
+        <w:spacing w:after="100" w:before="0"/>
+      </w:pPr>
+      <w:r>
+        <w:rPr>
+          <w:rFonts w:ascii="Arial" w:cs="Arial" w:eastAsia="Arial" w:hAnsi="Arial"/>
+          <w:color w:val="1A1A1A"/>
+          <w:sz w:val="22"/>
+          <w:szCs w:val="22"/>
+        </w:rPr>
+        <w:t xml:space="preserve">Only customer balances (Accounts Receivable) and supplier balances (Accounts Payable), party by party. Bank accounts, cash, and other general-ledger accounts are not touched by this process — they remain managed in Sage.</w:t>
+      </w:r>
+    </w:p>
+    <w:p>
+      <w:pPr>
+        <w:spacing w:after="40" w:before="200"/>
+      </w:pPr>
+      <w:r>
+        <w:rPr>
+          <w:rFonts w:ascii="Arial" w:cs="Arial" w:eastAsia="Arial" w:hAnsi="Arial"/>
+          <w:b/>
+          <w:bCs/>
+          <w:color w:val="1F3864"/>
+          <w:sz w:val="22"/>
+          <w:szCs w:val="22"/>
+        </w:rPr>
+        <w:t xml:space="preserve">When can I trust ERPNext’s debtor and creditor reports?</w:t>
+      </w:r>
+    </w:p>
+    <w:p>
+      <w:pPr>
+        <w:spacing w:after="100" w:before="0"/>
+      </w:pPr>
+      <w:r>
+        <w:rPr>
+          <w:rFonts w:ascii="Arial" w:cs="Arial" w:eastAsia="Arial" w:hAnsi="Arial"/>
+          <w:color w:val="1A1A1A"/>
+          <w:sz w:val="22"/>
+          <w:szCs w:val="22"/>
+        </w:rPr>
+        <w:t xml:space="preserve">Once the period’s reconciliation has run for that company. At period-end, confirming the run completed and that the Sage Payments Clearing account nets to zero is the quickest way to know ERPNext’s ageing and management reports are sitting on Sage-aligned figures.</w:t>
+      </w:r>
+    </w:p>
+    <w:p>
+      <w:pPr>
+        <w:spacing w:after="40" w:before="200"/>
+      </w:pPr>
+      <w:r>
+        <w:rPr>
+          <w:rFonts w:ascii="Arial" w:cs="Arial" w:eastAsia="Arial" w:hAnsi="Arial"/>
+          <w:b/>
+          <w:bCs/>
+          <w:color w:val="1F3864"/>
+          <w:sz w:val="22"/>
+          <w:szCs w:val="22"/>
+        </w:rPr>
+        <w:t xml:space="preserve">Is ERPNext now a SARS-compliant set of books?</w:t>
+      </w:r>
+    </w:p>
+    <w:p>
+      <w:pPr>
+        <w:spacing w:after="100" w:before="0"/>
+      </w:pPr>
+      <w:r>
+        <w:rPr>
+          <w:rFonts w:ascii="Arial" w:cs="Arial" w:eastAsia="Arial" w:hAnsi="Arial"/>
+          <w:color w:val="1A1A1A"/>
+          <w:sz w:val="22"/>
+          <w:szCs w:val="22"/>
+        </w:rPr>
+        <w:t xml:space="preserve">No. ERPNext’s reconciled balances are accurate enough for internal management and operational reporting and for consolidated multi-company views. Statutory reporting, VAT returns, and SARS submissions stay in Sage, which remains the financial record of truth.</w:t>
+      </w:r>
+    </w:p>
+    <w:p>
+      <w:pPr>
+        <w:shd w:fill="1F3864" w:color="auto" w:val="clear"/>
+        <w:spacing w:after="120" w:before="360"/>
+        <w:ind w:left="180" w:right="180"/>
+      </w:pPr>
+      <w:r>
+        <w:rPr>
+          <w:rFonts w:ascii="Arial" w:cs="Arial" w:eastAsia="Arial" w:hAnsi="Arial"/>
+          <w:b/>
+          <w:bCs/>
+          <w:color w:val="FFFFFF"/>
+          <w:sz w:val="32"/>
+          <w:szCs w:val="32"/>
+        </w:rPr>
+        <w:t xml:space="preserve">9. The Golden Rules</w:t>
+      </w:r>
+    </w:p>
+    <w:p>
+      <w:pPr>
+        <w:spacing w:after="80" w:before="80"/>
+      </w:pPr>
+      <w:r>
+        <w:rPr>
+          <w:rFonts w:ascii="Arial" w:cs="Arial" w:eastAsia="Arial" w:hAnsi="Arial"/>
+          <w:color w:val="1A1A1A"/>
+          <w:sz w:val="22"/>
+          <w:szCs w:val="22"/>
+        </w:rPr>
+        <w:t xml:space="preserve">If you remember nothing else from this guide:</w:t>
       </w:r>
     </w:p>
     <w:p>
@@ -3251,21 +3951,83 @@
           <w:sz w:val="22"/>
           <w:szCs w:val="22"/>
         </w:rPr>
-        <w:t xml:space="preserve">Year-end close procedures</w:t>
-      </w:r>
-    </w:p>
-    <w:p>
-      <w:pPr>
-        <w:spacing w:after="80" w:before="80"/>
-      </w:pPr>
-      <w:r>
-        <w:rPr>
-          <w:rFonts w:ascii="Arial" w:cs="Arial" w:eastAsia="Arial" w:hAnsi="Arial"/>
-          <w:color w:val="1A1A1A"/>
-          <w:sz w:val="22"/>
-          <w:szCs w:val="22"/>
-        </w:rPr>
-        <w:t xml:space="preserve">ERPNext reflects the net result of these activities through the monthly balance reconciliation — it sees the outcome (aligned closing balances) rather than the individual transactions. Note that the reconciliation aligns customer and supplier balances only; bank, cash, and other general-ledger accounts are not reconciled by this process and remain Sage’s domain.</w:t>
+        <w:t xml:space="preserve">Create each transaction once, in the system that owns it — operational documents in ERPNext, payments and tax in Sage.</w:t>
+      </w:r>
+    </w:p>
+    <w:p>
+      <w:pPr>
+        <w:pStyle w:val="ListParagraph"/>
+        <w:numPr>
+          <w:ilvl w:val="0"/>
+          <w:numId w:val="2"/>
+        </w:numPr>
+        <w:spacing w:after="60" w:before="60"/>
+      </w:pPr>
+      <w:r>
+        <w:rPr>
+          <w:rFonts w:ascii="Arial" w:cs="Arial" w:eastAsia="Arial" w:hAnsi="Arial"/>
+          <w:color w:val="1A1A1A"/>
+          <w:sz w:val="22"/>
+          <w:szCs w:val="22"/>
+        </w:rPr>
+        <w:t xml:space="preserve">Anything involving physical stock must start in ERPNext. Pure-service invoices may be captured directly in Sage.</w:t>
+      </w:r>
+    </w:p>
+    <w:p>
+      <w:pPr>
+        <w:pStyle w:val="ListParagraph"/>
+        <w:numPr>
+          <w:ilvl w:val="0"/>
+          <w:numId w:val="2"/>
+        </w:numPr>
+        <w:spacing w:after="60" w:before="60"/>
+      </w:pPr>
+      <w:r>
+        <w:rPr>
+          <w:rFonts w:ascii="Arial" w:cs="Arial" w:eastAsia="Arial" w:hAnsi="Arial"/>
+          <w:color w:val="1A1A1A"/>
+          <w:sz w:val="22"/>
+          <w:szCs w:val="22"/>
+        </w:rPr>
+        <w:t xml:space="preserve">Sage is the financial record of truth. ERPNext’s figures are aligned to Sage, never the other way around.</w:t>
+      </w:r>
+    </w:p>
+    <w:p>
+      <w:pPr>
+        <w:pStyle w:val="ListParagraph"/>
+        <w:numPr>
+          <w:ilvl w:val="0"/>
+          <w:numId w:val="2"/>
+        </w:numPr>
+        <w:spacing w:after="60" w:before="60"/>
+      </w:pPr>
+      <w:r>
+        <w:rPr>
+          <w:rFonts w:ascii="Arial" w:cs="Arial" w:eastAsia="Arial" w:hAnsi="Arial"/>
+          <w:color w:val="1A1A1A"/>
+          <w:sz w:val="22"/>
+          <w:szCs w:val="22"/>
+        </w:rPr>
+        <w:t xml:space="preserve">Payments are never re-captured in ERPNext — the monthly reconciliation handles them.</w:t>
+      </w:r>
+    </w:p>
+    <w:p>
+      <w:pPr>
+        <w:pStyle w:val="ListParagraph"/>
+        <w:numPr>
+          <w:ilvl w:val="0"/>
+          <w:numId w:val="2"/>
+        </w:numPr>
+        <w:spacing w:after="60" w:before="60"/>
+      </w:pPr>
+      <w:r>
+        <w:rPr>
+          <w:rFonts w:ascii="Arial" w:cs="Arial" w:eastAsia="Arial" w:hAnsi="Arial"/>
+          <w:color w:val="1A1A1A"/>
+          <w:sz w:val="22"/>
+          <w:szCs w:val="22"/>
+        </w:rPr>
+        <w:t xml:space="preserve">At month-end, a “Sage Payments Clearing” balance of zero means the two systems agree.</w:t>
       </w:r>
     </w:p>
     <w:p>
@@ -3283,7 +4045,7 @@
           <w:sz w:val="32"/>
           <w:szCs w:val="32"/>
         </w:rPr>
-        <w:t xml:space="preserve">7. Glossary</w:t>
+        <w:t xml:space="preserve">10. Glossary</w:t>
       </w:r>
     </w:p>
     <w:tbl>
@@ -3564,7 +4326,7 @@
                 <w:sz w:val="20"/>
                 <w:szCs w:val="20"/>
               </w:rPr>
-              <w:t xml:space="preserve">A transit account in ERPNext that holds one side of every reconciliation entry. It nets to zero once the two systems are in alignment.</w:t>
+              <w:t xml:space="preserve">A transit account in ERPNext that holds one side of every reconciliation entry. It nets to zero once the two systems are in alignment. Auto-created per company.</w:t>
             </w:r>
           </w:p>
         </w:tc>
@@ -3928,7 +4690,7 @@
                 <w:sz w:val="20"/>
                 <w:szCs w:val="20"/>
               </w:rPr>
-              <w:t xml:space="preserve">Toggle</w:t>
+              <w:t xml:space="preserve">Customer / Supplier Category</w:t>
             </w:r>
           </w:p>
         </w:tc>
@@ -3960,300 +4722,78 @@
                 <w:sz w:val="20"/>
                 <w:szCs w:val="20"/>
               </w:rPr>
+              <w:t xml:space="preserve">Sage’s grouping of customers and suppliers. These are mirrored into ERPNext as Customer Groups and Supplier Groups, and each party is filed under its category.</w:t>
+            </w:r>
+          </w:p>
+        </w:tc>
+      </w:tr>
+      <w:tr>
+        <w:tc>
+          <w:tcPr>
+            <w:tcW w:type="dxa" w:w="2450"/>
+            <w:tcBorders>
+              <w:top w:val="single" w:color="CCCCCC" w:sz="1"/>
+              <w:left w:val="single" w:color="CCCCCC" w:sz="1"/>
+              <w:bottom w:val="single" w:color="CCCCCC" w:sz="1"/>
+              <w:right w:val="single" w:color="CCCCCC" w:sz="1"/>
+            </w:tcBorders>
+            <w:shd w:fill="F2F4F7" w:color="auto" w:val="clear"/>
+            <w:tcMar>
+              <w:top w:type="dxa" w:w="80"/>
+              <w:left w:type="dxa" w:w="140"/>
+              <w:bottom w:type="dxa" w:w="80"/>
+              <w:right w:type="dxa" w:w="140"/>
+            </w:tcMar>
+            <w:vAlign w:val="center"/>
+          </w:tcPr>
+          <w:p>
+            <w:r>
+              <w:rPr>
+                <w:rFonts w:ascii="Arial" w:cs="Arial" w:eastAsia="Arial" w:hAnsi="Arial"/>
+                <w:b/>
+                <w:bCs/>
+                <w:color w:val="1A1A1A"/>
+                <w:sz w:val="20"/>
+                <w:szCs w:val="20"/>
+              </w:rPr>
+              <w:t xml:space="preserve">Toggle</w:t>
+            </w:r>
+          </w:p>
+        </w:tc>
+        <w:tc>
+          <w:tcPr>
+            <w:tcW w:type="dxa" w:w="7188"/>
+            <w:tcBorders>
+              <w:top w:val="single" w:color="CCCCCC" w:sz="1"/>
+              <w:left w:val="single" w:color="CCCCCC" w:sz="1"/>
+              <w:bottom w:val="single" w:color="CCCCCC" w:sz="1"/>
+              <w:right w:val="single" w:color="CCCCCC" w:sz="1"/>
+            </w:tcBorders>
+            <w:shd w:fill="F2F4F7" w:color="auto" w:val="clear"/>
+            <w:tcMar>
+              <w:top w:type="dxa" w:w="80"/>
+              <w:left w:type="dxa" w:w="140"/>
+              <w:bottom w:type="dxa" w:w="80"/>
+              <w:right w:type="dxa" w:w="140"/>
+            </w:tcMar>
+            <w:vAlign w:val="center"/>
+          </w:tcPr>
+          <w:p>
+            <w:r>
+              <w:rPr>
+                <w:rFonts w:ascii="Arial" w:cs="Arial" w:eastAsia="Arial" w:hAnsi="Arial"/>
+                <w:b w:val="false"/>
+                <w:bCs w:val="false"/>
+                <w:color w:val="1A1A1A"/>
+                <w:sz w:val="20"/>
+                <w:szCs w:val="20"/>
+              </w:rPr>
               <w:t xml:space="preserve">An on/off switch in the system settings that enables or disables a specific sync type without affecting the rest of the integration.</w:t>
             </w:r>
           </w:p>
         </w:tc>
       </w:tr>
     </w:tbl>
-    <w:p>
-      <w:pPr>
-        <w:shd w:fill="1F3864" w:color="auto" w:val="clear"/>
-        <w:spacing w:after="120" w:before="360"/>
-        <w:ind w:left="180" w:right="180"/>
-      </w:pPr>
-      <w:r>
-        <w:rPr>
-          <w:rFonts w:ascii="Arial" w:cs="Arial" w:eastAsia="Arial" w:hAnsi="Arial"/>
-          <w:b/>
-          <w:bCs/>
-          <w:color w:val="FFFFFF"/>
-          <w:sz w:val="32"/>
-          <w:szCs w:val="32"/>
-        </w:rPr>
-        <w:t xml:space="preserve">8. Common Questions</w:t>
-      </w:r>
-    </w:p>
-    <w:p>
-      <w:pPr>
-        <w:spacing w:after="40" w:before="200"/>
-      </w:pPr>
-      <w:r>
-        <w:rPr>
-          <w:rFonts w:ascii="Arial" w:cs="Arial" w:eastAsia="Arial" w:hAnsi="Arial"/>
-          <w:b/>
-          <w:bCs/>
-          <w:color w:val="1F3864"/>
-          <w:sz w:val="22"/>
-          <w:szCs w:val="22"/>
-        </w:rPr>
-        <w:t xml:space="preserve">How often does the reconciliation actually run?</w:t>
-      </w:r>
-    </w:p>
-    <w:p>
-      <w:pPr>
-        <w:spacing w:after="100" w:before="0"/>
-      </w:pPr>
-      <w:r>
-        <w:rPr>
-          <w:rFonts w:ascii="Arial" w:cs="Arial" w:eastAsia="Arial" w:hAnsi="Arial"/>
-          <w:color w:val="1A1A1A"/>
-          <w:sz w:val="22"/>
-          <w:szCs w:val="22"/>
-        </w:rPr>
-        <w:t xml:space="preserve">The job runs once a day. But because each customer and supplier is reconciled at most once per calendar month, the practical effect is monthly: the first time a party’s balance drifts in a month it is corrected within about a day, and any further drift that same month is picked up at the start of the next month. This is deliberate — it keeps one clean reconciliation journal per party per month rather than a stream of small ones.</w:t>
-      </w:r>
-    </w:p>
-    <w:p>
-      <w:pPr>
-        <w:spacing w:after="40" w:before="200"/>
-      </w:pPr>
-      <w:r>
-        <w:rPr>
-          <w:rFonts w:ascii="Arial" w:cs="Arial" w:eastAsia="Arial" w:hAnsi="Arial"/>
-          <w:b/>
-          <w:bCs/>
-          <w:color w:val="1F3864"/>
-          <w:sz w:val="22"/>
-          <w:szCs w:val="22"/>
-        </w:rPr>
-        <w:t xml:space="preserve">Why did a customer’s balance go up after reconciliation?</w:t>
-      </w:r>
-    </w:p>
-    <w:p>
-      <w:pPr>
-        <w:spacing w:after="100" w:before="0"/>
-      </w:pPr>
-      <w:r>
-        <w:rPr>
-          <w:rFonts w:ascii="Arial" w:cs="Arial" w:eastAsia="Arial" w:hAnsi="Arial"/>
-          <w:color w:val="1A1A1A"/>
-          <w:sz w:val="22"/>
-          <w:szCs w:val="22"/>
-        </w:rPr>
-        <w:t xml:space="preserve">Usually reconciliation reduces a customer’s balance, because the customer has paid in Sage and ERPNext did not know. But if an invoice was captured directly in Sage, ERPNext’s balance was too low — so the journal increases it instead. The direction always follows Sage: ERPNext is moved to wherever Sage’s closing balance sits.</w:t>
-      </w:r>
-    </w:p>
-    <w:p>
-      <w:pPr>
-        <w:spacing w:after="40" w:before="200"/>
-      </w:pPr>
-      <w:r>
-        <w:rPr>
-          <w:rFonts w:ascii="Arial" w:cs="Arial" w:eastAsia="Arial" w:hAnsi="Arial"/>
-          <w:b/>
-          <w:bCs/>
-          <w:color w:val="1F3864"/>
-          <w:sz w:val="22"/>
-          <w:szCs w:val="22"/>
-        </w:rPr>
-        <w:t xml:space="preserve">Do reconciliation journals affect VAT?</w:t>
-      </w:r>
-    </w:p>
-    <w:p>
-      <w:pPr>
-        <w:spacing w:after="100" w:before="0"/>
-      </w:pPr>
-      <w:r>
-        <w:rPr>
-          <w:rFonts w:ascii="Arial" w:cs="Arial" w:eastAsia="Arial" w:hAnsi="Arial"/>
-          <w:color w:val="1A1A1A"/>
-          <w:sz w:val="22"/>
-          <w:szCs w:val="22"/>
-        </w:rPr>
-        <w:t xml:space="preserve">No. A reconciliation journal posts between a control account (Accounts Receivable or Accounts Payable) and the Sage Payments Clearing account, with no tax lines. VAT, tax periods, and SARS submissions remain entirely in Sage.</w:t>
-      </w:r>
-    </w:p>
-    <w:p>
-      <w:pPr>
-        <w:spacing w:after="40" w:before="200"/>
-      </w:pPr>
-      <w:r>
-        <w:rPr>
-          <w:rFonts w:ascii="Arial" w:cs="Arial" w:eastAsia="Arial" w:hAnsi="Arial"/>
-          <w:b/>
-          <w:bCs/>
-          <w:color w:val="1F3864"/>
-          <w:sz w:val="22"/>
-          <w:szCs w:val="22"/>
-        </w:rPr>
-        <w:t xml:space="preserve">What if a customer or supplier in Sage has no match in ERPNext?</w:t>
-      </w:r>
-    </w:p>
-    <w:p>
-      <w:pPr>
-        <w:spacing w:after="100" w:before="0"/>
-      </w:pPr>
-      <w:r>
-        <w:rPr>
-          <w:rFonts w:ascii="Arial" w:cs="Arial" w:eastAsia="Arial" w:hAnsi="Arial"/>
-          <w:color w:val="1A1A1A"/>
-          <w:sz w:val="22"/>
-          <w:szCs w:val="22"/>
-        </w:rPr>
-        <w:t xml:space="preserve">That party is skipped for the run and noted in the logs — no journal is posted. Once the matching customer or supplier exists in ERPNext (it will usually sync across from Sage automatically), the next reconciliation run picks it up.</w:t>
-      </w:r>
-    </w:p>
-    <w:p>
-      <w:pPr>
-        <w:spacing w:after="40" w:before="200"/>
-      </w:pPr>
-      <w:r>
-        <w:rPr>
-          <w:rFonts w:ascii="Arial" w:cs="Arial" w:eastAsia="Arial" w:hAnsi="Arial"/>
-          <w:b/>
-          <w:bCs/>
-          <w:color w:val="1F3864"/>
-          <w:sz w:val="22"/>
-          <w:szCs w:val="22"/>
-        </w:rPr>
-        <w:t xml:space="preserve">Can a reconciliation journal be reversed or corrected?</w:t>
-      </w:r>
-    </w:p>
-    <w:p>
-      <w:pPr>
-        <w:spacing w:after="100" w:before="0"/>
-      </w:pPr>
-      <w:r>
-        <w:rPr>
-          <w:rFonts w:ascii="Arial" w:cs="Arial" w:eastAsia="Arial" w:hAnsi="Arial"/>
-          <w:color w:val="1A1A1A"/>
-          <w:sz w:val="22"/>
-          <w:szCs w:val="22"/>
-        </w:rPr>
-        <w:t xml:space="preserve">Yes — cancel the Journal Entry in ERPNext as you would any journal. Important: also delete or amend the matching row in the Sage Reconciliation Log. If the “Created” log row is left in place, the daily job treats that party and period as already done and will not post a replacement.</w:t>
-      </w:r>
-    </w:p>
-    <w:p>
-      <w:pPr>
-        <w:spacing w:after="40" w:before="200"/>
-      </w:pPr>
-      <w:r>
-        <w:rPr>
-          <w:rFonts w:ascii="Arial" w:cs="Arial" w:eastAsia="Arial" w:hAnsi="Arial"/>
-          <w:b/>
-          <w:bCs/>
-          <w:color w:val="1F3864"/>
-          <w:sz w:val="22"/>
-          <w:szCs w:val="22"/>
-        </w:rPr>
-        <w:t xml:space="preserve">What happens if Sage cannot be reached on a given day?</w:t>
-      </w:r>
-    </w:p>
-    <w:p>
-      <w:pPr>
-        <w:spacing w:after="100" w:before="0"/>
-      </w:pPr>
-      <w:r>
-        <w:rPr>
-          <w:rFonts w:ascii="Arial" w:cs="Arial" w:eastAsia="Arial" w:hAnsi="Arial"/>
-          <w:color w:val="1A1A1A"/>
-          <w:sz w:val="22"/>
-          <w:szCs w:val="22"/>
-        </w:rPr>
-        <w:t xml:space="preserve">That company is skipped for that run, the failure is logged, and the “last reconciliation” marker is not advanced — so the next run simply repeats the same period. Nothing is lost or double-counted, because the Sage Reconciliation Log keeps the process idempotent.</w:t>
-      </w:r>
-    </w:p>
-    <w:p>
-      <w:pPr>
-        <w:spacing w:after="40" w:before="200"/>
-      </w:pPr>
-      <w:r>
-        <w:rPr>
-          <w:rFonts w:ascii="Arial" w:cs="Arial" w:eastAsia="Arial" w:hAnsi="Arial"/>
-          <w:b/>
-          <w:bCs/>
-          <w:color w:val="1F3864"/>
-          <w:sz w:val="22"/>
-          <w:szCs w:val="22"/>
-        </w:rPr>
-        <w:t xml:space="preserve">Which balances does the reconciliation actually align?</w:t>
-      </w:r>
-    </w:p>
-    <w:p>
-      <w:pPr>
-        <w:spacing w:after="100" w:before="0"/>
-      </w:pPr>
-      <w:r>
-        <w:rPr>
-          <w:rFonts w:ascii="Arial" w:cs="Arial" w:eastAsia="Arial" w:hAnsi="Arial"/>
-          <w:color w:val="1A1A1A"/>
-          <w:sz w:val="22"/>
-          <w:szCs w:val="22"/>
-        </w:rPr>
-        <w:t xml:space="preserve">Only customer balances (Accounts Receivable) and supplier balances (Accounts Payable), party by party. Bank accounts, cash, and other general-ledger accounts are not touched by this process — they remain managed in Sage.</w:t>
-      </w:r>
-    </w:p>
-    <w:p>
-      <w:pPr>
-        <w:spacing w:after="40" w:before="200"/>
-      </w:pPr>
-      <w:r>
-        <w:rPr>
-          <w:rFonts w:ascii="Arial" w:cs="Arial" w:eastAsia="Arial" w:hAnsi="Arial"/>
-          <w:b/>
-          <w:bCs/>
-          <w:color w:val="1F3864"/>
-          <w:sz w:val="22"/>
-          <w:szCs w:val="22"/>
-        </w:rPr>
-        <w:t xml:space="preserve">When can I trust ERPNext’s debtor and creditor reports?</w:t>
-      </w:r>
-    </w:p>
-    <w:p>
-      <w:pPr>
-        <w:spacing w:after="100" w:before="0"/>
-      </w:pPr>
-      <w:r>
-        <w:rPr>
-          <w:rFonts w:ascii="Arial" w:cs="Arial" w:eastAsia="Arial" w:hAnsi="Arial"/>
-          <w:color w:val="1A1A1A"/>
-          <w:sz w:val="22"/>
-          <w:szCs w:val="22"/>
-        </w:rPr>
-        <w:t xml:space="preserve">Once the period’s reconciliation has run for that company. At period-end, confirming the run completed and that the Sage Payments Clearing account nets to zero is the quickest way to know ERPNext’s ageing and management reports are sitting on Sage-aligned figures.</w:t>
-      </w:r>
-    </w:p>
-    <w:p>
-      <w:pPr>
-        <w:spacing w:after="40" w:before="200"/>
-      </w:pPr>
-      <w:r>
-        <w:rPr>
-          <w:rFonts w:ascii="Arial" w:cs="Arial" w:eastAsia="Arial" w:hAnsi="Arial"/>
-          <w:b/>
-          <w:bCs/>
-          <w:color w:val="1F3864"/>
-          <w:sz w:val="22"/>
-          <w:szCs w:val="22"/>
-        </w:rPr>
-        <w:t xml:space="preserve">Is ERPNext now a SARS-compliant set of books?</w:t>
-      </w:r>
-    </w:p>
-    <w:p>
-      <w:pPr>
-        <w:spacing w:after="100" w:before="0"/>
-      </w:pPr>
-      <w:r>
-        <w:rPr>
-          <w:rFonts w:ascii="Arial" w:cs="Arial" w:eastAsia="Arial" w:hAnsi="Arial"/>
-          <w:color w:val="1A1A1A"/>
-          <w:sz w:val="22"/>
-          <w:szCs w:val="22"/>
-        </w:rPr>
-        <w:t xml:space="preserve">No. ERPNext’s reconciled balances are accurate enough for internal management and operational reporting and for consolidated multi-company views. Statutory reporting, VAT returns, and SARS submissions stay in Sage, which remains the financial record of truth.</w:t>
-      </w:r>
-    </w:p>
     <w:p>
       <w:pPr>
         <w:spacing w:after="0" w:before="280"/>
@@ -4274,7 +4814,7 @@
           <w:sz w:val="20"/>
           <w:szCs w:val="20"/>
         </w:rPr>
-        <w:t xml:space="preserve">Questions or concerns about the synchronisation should be directed to your Syncflo system administrator. This document describes the integration as designed. Where system behaviour differs from this document, please report it promptly.</w:t>
+        <w:t xml:space="preserve">Questions or concerns about the synchronisation should be directed to your Syncflo system administrator. This guide describes the integration as designed. Where system behaviour differs from this guide, please report it promptly.</w:t>
       </w:r>
     </w:p>
     <w:p>
@@ -4290,7 +4830,7 @@
           <w:sz w:val="18"/>
           <w:szCs w:val="18"/>
         </w:rPr>
-        <w:t xml:space="preserve">Revision: May 2026 — updated to cover the scheduled payment reconciliation (Sections 3.4, 5, and 8).</w:t>
+        <w:t xml:space="preserve">Revision: May 2026 — consolidated guide covering the integration, the scheduled payment reconciliation, and the customer/supplier category sync.</w:t>
       </w:r>
     </w:p>
     <w:sectPr>

</xml_diff>